<commit_message>
in project plan the section plan (approach) was started
</commit_message>
<xml_diff>
--- a/Individual project/LO-01/Analysing/ProjectPlan_TrustPartner.docx
+++ b/Individual project/LO-01/Analysing/ProjectPlan_TrustPartner.docx
@@ -59,7 +59,6 @@
       </w:pPr>
       <w:bookmarkStart w:id="1" w:name="Projectnaam"/>
       <w:bookmarkStart w:id="2" w:name="_Toc327581041"/>
-      <w:proofErr w:type="spellStart"/>
       <w:r>
         <w:rPr>
           <w:b/>
@@ -68,7 +67,6 @@
         </w:rPr>
         <w:t>TruePartner</w:t>
       </w:r>
-      <w:proofErr w:type="spellEnd"/>
       <w:r>
         <w:rPr>
           <w:b/>
@@ -171,15 +169,7 @@
           <w:sz w:val="26"/>
           <w:szCs w:val="26"/>
         </w:rPr>
-        <w:t xml:space="preserve"> </w:t>
-      </w:r>
-      <w:r>
-        <w:rPr>
-          <w:i/>
-          <w:sz w:val="26"/>
-          <w:szCs w:val="26"/>
-        </w:rPr>
-        <w:t>IN-SDE4</w:t>
+        <w:t xml:space="preserve"> IN-SDE4</w:t>
       </w:r>
     </w:p>
     <w:p>
@@ -239,10 +229,11 @@
       <w:r>
         <w:rPr>
           <w:i/>
+          <w:noProof/>
           <w:sz w:val="26"/>
           <w:szCs w:val="26"/>
         </w:rPr>
-        <w:t>2026-03-04</w:t>
+        <w:t>2026-03-06</w:t>
       </w:r>
       <w:r>
         <w:rPr>
@@ -287,7 +278,6 @@
           <w:sz w:val="24"/>
         </w:rPr>
       </w:pPr>
-      <w:proofErr w:type="spellStart"/>
       <w:r>
         <w:rPr>
           <w:b/>
@@ -296,7 +286,6 @@
         <w:lastRenderedPageBreak/>
         <w:t>Inhoudsopgave</w:t>
       </w:r>
-      <w:proofErr w:type="spellEnd"/>
     </w:p>
     <w:p/>
     <w:p>
@@ -1548,7 +1537,7 @@
         <w:tabs>
           <w:tab w:val="num" w:pos="709"/>
         </w:tabs>
-        <w:spacing w:line="276" w:lineRule="auto"/>
+        <w:spacing w:line="360" w:lineRule="auto"/>
         <w:ind w:left="567"/>
         <w:jc w:val="both"/>
         <w:rPr>
@@ -1559,8 +1548,6 @@
         <w:rPr>
           <w:rFonts w:cs="Arial"/>
           <w:color w:val="000000"/>
-          <w:sz w:val="16"/>
-          <w:szCs w:val="16"/>
         </w:rPr>
         <w:t xml:space="preserve">The project is about </w:t>
       </w:r>
@@ -1568,8 +1555,6 @@
         <w:rPr>
           <w:rFonts w:cs="Arial"/>
           <w:color w:val="000000"/>
-          <w:sz w:val="16"/>
-          <w:szCs w:val="16"/>
         </w:rPr>
         <w:t xml:space="preserve">CaaS (Car-As-A-Service) platform for managing renting an electric vehicle with clear policies and transparency. </w:t>
       </w:r>
@@ -1577,8 +1562,6 @@
         <w:rPr>
           <w:rFonts w:cs="Arial"/>
           <w:color w:val="000000"/>
-          <w:sz w:val="16"/>
-          <w:szCs w:val="16"/>
         </w:rPr>
         <w:t>Customers could browse through a selection of available vehicles and find their suitable choice by searching car brands, models, price range</w:t>
       </w:r>
@@ -1586,8 +1569,6 @@
         <w:rPr>
           <w:rFonts w:cs="Arial"/>
           <w:color w:val="000000"/>
-          <w:sz w:val="16"/>
-          <w:szCs w:val="16"/>
         </w:rPr>
         <w:t>, etc</w:t>
       </w:r>
@@ -1595,8 +1576,6 @@
         <w:rPr>
           <w:rFonts w:cs="Arial"/>
           <w:color w:val="000000"/>
-          <w:sz w:val="16"/>
-          <w:szCs w:val="16"/>
         </w:rPr>
         <w:t>.</w:t>
       </w:r>
@@ -1608,6 +1587,7 @@
           <w:tab w:val="clear" w:pos="992"/>
           <w:tab w:val="num" w:pos="851"/>
         </w:tabs>
+        <w:spacing w:line="276" w:lineRule="auto"/>
         <w:ind w:left="567" w:hanging="141"/>
       </w:pPr>
       <w:bookmarkStart w:id="9" w:name="_Toc89965972"/>
@@ -1630,13 +1610,12 @@
     </w:p>
     <w:p>
       <w:pPr>
+        <w:spacing w:line="276" w:lineRule="auto"/>
         <w:ind w:left="567"/>
         <w:jc w:val="both"/>
         <w:rPr>
           <w:rFonts w:cs="Arial"/>
           <w:color w:val="000000"/>
-          <w:sz w:val="16"/>
-          <w:szCs w:val="16"/>
           <w:lang w:eastAsia="nl-NL"/>
         </w:rPr>
       </w:pPr>
@@ -1644,8 +1623,6 @@
         <w:rPr>
           <w:rFonts w:cs="Arial"/>
           <w:color w:val="000000"/>
-          <w:sz w:val="16"/>
-          <w:szCs w:val="16"/>
           <w:lang w:eastAsia="nl-NL"/>
         </w:rPr>
         <w:t xml:space="preserve">The goal of the project is to achieve </w:t>
@@ -1654,31 +1631,9 @@
         <w:rPr>
           <w:rFonts w:cs="Arial"/>
           <w:color w:val="000000"/>
-          <w:sz w:val="16"/>
-          <w:szCs w:val="16"/>
           <w:lang w:eastAsia="nl-NL"/>
         </w:rPr>
-        <w:t xml:space="preserve">trust and transparency in the sector by clearly stating fuel policies, insurance coverage… Moreover, the project strives to eliminate emissions by </w:t>
-      </w:r>
-      <w:r>
-        <w:rPr>
-          <w:rFonts w:cs="Arial"/>
-          <w:color w:val="000000"/>
-          <w:sz w:val="16"/>
-          <w:szCs w:val="16"/>
-          <w:lang w:eastAsia="nl-NL"/>
-        </w:rPr>
-        <w:t>promoting</w:t>
-      </w:r>
-      <w:r>
-        <w:rPr>
-          <w:rFonts w:cs="Arial"/>
-          <w:color w:val="000000"/>
-          <w:sz w:val="16"/>
-          <w:szCs w:val="16"/>
-          <w:lang w:eastAsia="nl-NL"/>
-        </w:rPr>
-        <w:t xml:space="preserve"> only electric vehicles.</w:t>
+        <w:t>trust and transparency in the sector by clearly stating fuel policies, insurance coverage… Moreover, the project strives to eliminate emissions by promoting only electric vehicles.</w:t>
       </w:r>
     </w:p>
     <w:p>
@@ -1711,7 +1666,7 @@
           <w:tab w:val="clear" w:pos="992"/>
           <w:tab w:val="num" w:pos="851"/>
         </w:tabs>
-        <w:ind w:left="709" w:hanging="283"/>
+        <w:ind w:left="567" w:hanging="141"/>
       </w:pPr>
       <w:bookmarkStart w:id="13" w:name="_Toc89965974"/>
       <w:bookmarkEnd w:id="10"/>
@@ -1834,7 +1789,7 @@
               <w:rPr>
                 <w:sz w:val="20"/>
               </w:rPr>
-              <w:t>Low fidelity prototype</w:t>
+              <w:t>Project plan</w:t>
             </w:r>
           </w:p>
         </w:tc>
@@ -1858,7 +1813,7 @@
               <w:rPr>
                 <w:sz w:val="20"/>
               </w:rPr>
-              <w:t>Full working version</w:t>
+              <w:t>User manual</w:t>
             </w:r>
           </w:p>
         </w:tc>
@@ -1888,7 +1843,7 @@
               <w:rPr>
                 <w:sz w:val="20"/>
               </w:rPr>
-              <w:t>High fidelity prototype</w:t>
+              <w:t>Analysis document</w:t>
             </w:r>
           </w:p>
         </w:tc>
@@ -1912,7 +1867,7 @@
               <w:rPr>
                 <w:sz w:val="20"/>
               </w:rPr>
-              <w:t>Payment system</w:t>
+              <w:t>Deployment of the application</w:t>
             </w:r>
           </w:p>
         </w:tc>
@@ -1942,7 +1897,7 @@
               <w:rPr>
                 <w:sz w:val="20"/>
               </w:rPr>
-              <w:t>MVP functional product</w:t>
+              <w:t>Technical design guide</w:t>
             </w:r>
           </w:p>
         </w:tc>
@@ -1953,10 +1908,94 @@
           <w:p>
             <w:pPr>
               <w:pStyle w:val="Tabelbody"/>
+              <w:spacing w:after="0"/>
+              <w:rPr>
+                <w:sz w:val="20"/>
+              </w:rPr>
+            </w:pPr>
+          </w:p>
+        </w:tc>
+      </w:tr>
+      <w:tr>
+        <w:trPr>
+          <w:cantSplit/>
+          <w:trHeight w:val="340"/>
+        </w:trPr>
+        <w:tc>
+          <w:tcPr>
+            <w:tcW w:w="4536" w:type="dxa"/>
+          </w:tcPr>
+          <w:p>
+            <w:pPr>
+              <w:pStyle w:val="Tabelbody"/>
               <w:numPr>
                 <w:ilvl w:val="0"/>
-                <w:numId w:val="10"/>
+                <w:numId w:val="5"/>
               </w:numPr>
+              <w:spacing w:after="0"/>
+              <w:rPr>
+                <w:sz w:val="20"/>
+              </w:rPr>
+            </w:pPr>
+            <w:r>
+              <w:rPr>
+                <w:sz w:val="20"/>
+              </w:rPr>
+              <w:t>Source code documentation</w:t>
+            </w:r>
+          </w:p>
+        </w:tc>
+        <w:tc>
+          <w:tcPr>
+            <w:tcW w:w="4820" w:type="dxa"/>
+          </w:tcPr>
+          <w:p>
+            <w:pPr>
+              <w:pStyle w:val="Tabelbody"/>
+              <w:spacing w:after="0"/>
+              <w:rPr>
+                <w:sz w:val="20"/>
+              </w:rPr>
+            </w:pPr>
+          </w:p>
+        </w:tc>
+      </w:tr>
+      <w:tr>
+        <w:trPr>
+          <w:cantSplit/>
+          <w:trHeight w:val="340"/>
+        </w:trPr>
+        <w:tc>
+          <w:tcPr>
+            <w:tcW w:w="4536" w:type="dxa"/>
+          </w:tcPr>
+          <w:p>
+            <w:pPr>
+              <w:pStyle w:val="Tabelbody"/>
+              <w:numPr>
+                <w:ilvl w:val="0"/>
+                <w:numId w:val="5"/>
+              </w:numPr>
+              <w:spacing w:after="0"/>
+              <w:rPr>
+                <w:sz w:val="20"/>
+              </w:rPr>
+            </w:pPr>
+            <w:r>
+              <w:rPr>
+                <w:sz w:val="20"/>
+              </w:rPr>
+              <w:t>Test plan</w:t>
+            </w:r>
+          </w:p>
+        </w:tc>
+        <w:tc>
+          <w:tcPr>
+            <w:tcW w:w="4820" w:type="dxa"/>
+          </w:tcPr>
+          <w:p>
+            <w:pPr>
+              <w:pStyle w:val="Tabelbody"/>
               <w:spacing w:after="0"/>
               <w:rPr>
                 <w:sz w:val="20"/>
@@ -1972,26 +2011,756 @@
         <w:pStyle w:val="Heading2"/>
         <w:tabs>
           <w:tab w:val="clear" w:pos="992"/>
-          <w:tab w:val="num" w:pos="709"/>
-        </w:tabs>
-        <w:ind w:left="709"/>
-      </w:pPr>
-      <w:bookmarkStart w:id="14" w:name="_Toc89965975"/>
-      <w:r>
-        <w:t>Conditions</w:t>
-      </w:r>
-      <w:bookmarkEnd w:id="14"/>
-    </w:p>
-    <w:p>
-      <w:pPr>
+          <w:tab w:val="num" w:pos="851"/>
+        </w:tabs>
+        <w:ind w:left="567" w:hanging="141"/>
+      </w:pPr>
+      <w:r>
+        <w:t>Constraints</w:t>
+      </w:r>
+    </w:p>
+    <w:p>
+      <w:pPr>
+        <w:spacing w:line="360" w:lineRule="auto"/>
+        <w:ind w:left="567"/>
         <w:rPr>
           <w:i/>
           <w:iCs/>
-          <w:sz w:val="16"/>
-          <w:szCs w:val="16"/>
-        </w:rPr>
-      </w:pPr>
-      <w:r>
+          <w:u w:val="single"/>
+        </w:rPr>
+      </w:pPr>
+      <w:r>
+        <w:rPr>
+          <w:i/>
+          <w:iCs/>
+          <w:u w:val="single"/>
+        </w:rPr>
+        <w:t>Technology</w:t>
+      </w:r>
+    </w:p>
+    <w:p>
+      <w:pPr>
+        <w:spacing w:line="360" w:lineRule="auto"/>
+        <w:ind w:left="567"/>
+      </w:pPr>
+      <w:r>
+        <w:rPr>
+          <w:b/>
+          <w:bCs/>
+        </w:rPr>
+        <w:t>.NET</w:t>
+      </w:r>
+      <w:r>
+        <w:t xml:space="preserve"> ecosystem constrained</w:t>
+      </w:r>
+      <w:r>
+        <w:t xml:space="preserve"> technologies, where C# is the core backend language.</w:t>
+      </w:r>
+    </w:p>
+    <w:p>
+      <w:pPr>
+        <w:spacing w:line="360" w:lineRule="auto"/>
+        <w:ind w:left="567"/>
+        <w:rPr>
+          <w:i/>
+          <w:iCs/>
+          <w:u w:val="single"/>
+        </w:rPr>
+      </w:pPr>
+      <w:r>
+        <w:rPr>
+          <w:i/>
+          <w:iCs/>
+          <w:u w:val="single"/>
+        </w:rPr>
+        <w:t>Database</w:t>
+      </w:r>
+    </w:p>
+    <w:p>
+      <w:pPr>
+        <w:spacing w:line="360" w:lineRule="auto"/>
+        <w:ind w:left="567"/>
+      </w:pPr>
+      <w:r>
+        <w:t>MSSQL</w:t>
+      </w:r>
+      <w:r>
+        <w:t xml:space="preserve"> (relational) database for managing the application’s incoming data</w:t>
+      </w:r>
+      <w:r>
+        <w:t>.</w:t>
+      </w:r>
+    </w:p>
+    <w:p>
+      <w:pPr>
+        <w:spacing w:line="360" w:lineRule="auto"/>
+        <w:ind w:left="567"/>
+        <w:rPr>
+          <w:i/>
+          <w:iCs/>
+          <w:u w:val="single"/>
+        </w:rPr>
+      </w:pPr>
+      <w:r>
+        <w:rPr>
+          <w:i/>
+          <w:iCs/>
+          <w:u w:val="single"/>
+        </w:rPr>
+        <w:t>Deadline</w:t>
+      </w:r>
+    </w:p>
+    <w:p>
+      <w:pPr>
+        <w:spacing w:line="360" w:lineRule="auto"/>
+        <w:ind w:left="567"/>
+      </w:pPr>
+      <w:r>
+        <w:t>The final deadline for the submission of the project is June 18 by 5pm.</w:t>
+      </w:r>
+    </w:p>
+    <w:p>
+      <w:pPr>
+        <w:spacing w:line="360" w:lineRule="auto"/>
+        <w:ind w:left="567"/>
+        <w:rPr>
+          <w:i/>
+          <w:iCs/>
+          <w:u w:val="single"/>
+        </w:rPr>
+      </w:pPr>
+      <w:r>
+        <w:rPr>
+          <w:i/>
+          <w:iCs/>
+          <w:u w:val="single"/>
+        </w:rPr>
+        <w:t>Time to be dedicated</w:t>
+      </w:r>
+    </w:p>
+    <w:p>
+      <w:pPr>
+        <w:spacing w:line="360" w:lineRule="auto"/>
+        <w:ind w:left="567"/>
+      </w:pPr>
+      <w:r>
+        <w:t>The dedicated</w:t>
+      </w:r>
+      <w:r>
+        <w:t xml:space="preserve"> time</w:t>
+      </w:r>
+      <w:r>
+        <w:t xml:space="preserve"> </w:t>
+      </w:r>
+      <w:r>
+        <w:t>for</w:t>
+      </w:r>
+      <w:r>
+        <w:t xml:space="preserve"> the project would be </w:t>
+      </w:r>
+      <w:r>
+        <w:t>e</w:t>
+      </w:r>
+      <w:r>
+        <w:t>very Monday</w:t>
+      </w:r>
+      <w:r>
+        <w:t xml:space="preserve">, </w:t>
+      </w:r>
+      <w:r>
+        <w:t>Tuesday and Friday</w:t>
+      </w:r>
+      <w:r>
+        <w:t xml:space="preserve"> </w:t>
+      </w:r>
+      <w:r>
+        <w:t>(morning sessions</w:t>
+      </w:r>
+      <w:r>
+        <w:t>: 9am-1pm</w:t>
+      </w:r>
+      <w:r>
+        <w:t>)</w:t>
+      </w:r>
+      <w:r>
+        <w:t xml:space="preserve"> of the week</w:t>
+      </w:r>
+      <w:r>
+        <w:t xml:space="preserve"> from 9am-4pm.</w:t>
+      </w:r>
+    </w:p>
+    <w:p>
+      <w:pPr>
+        <w:pStyle w:val="Heading2"/>
+        <w:tabs>
+          <w:tab w:val="clear" w:pos="992"/>
+          <w:tab w:val="left" w:pos="851"/>
+        </w:tabs>
+        <w:ind w:left="567" w:hanging="141"/>
+      </w:pPr>
+      <w:bookmarkStart w:id="14" w:name="_Toc89965976"/>
+      <w:r>
+        <w:t>Finished products</w:t>
+      </w:r>
+      <w:bookmarkEnd w:id="14"/>
+    </w:p>
+    <w:p>
+      <w:pPr>
+        <w:pStyle w:val="BodyText"/>
+        <w:spacing w:line="360" w:lineRule="auto"/>
+        <w:ind w:left="567"/>
+        <w:rPr>
+          <w:rFonts w:ascii="Arial" w:hAnsi="Arial" w:cs="Arial"/>
+          <w:color w:val="000000"/>
+          <w:sz w:val="20"/>
+          <w:szCs w:val="20"/>
+        </w:rPr>
+      </w:pPr>
+      <w:r>
+        <w:rPr>
+          <w:rFonts w:ascii="Arial" w:hAnsi="Arial" w:cs="Arial"/>
+          <w:color w:val="000000"/>
+          <w:sz w:val="20"/>
+          <w:szCs w:val="20"/>
+        </w:rPr>
+        <w:t>This section gives an overview of</w:t>
+      </w:r>
+      <w:r>
+        <w:rPr>
+          <w:rFonts w:ascii="Arial" w:hAnsi="Arial" w:cs="Arial"/>
+          <w:color w:val="000000"/>
+          <w:sz w:val="20"/>
+          <w:szCs w:val="20"/>
+        </w:rPr>
+        <w:t xml:space="preserve"> the product breakdown structure</w:t>
+      </w:r>
+      <w:r>
+        <w:rPr>
+          <w:rFonts w:ascii="Arial" w:hAnsi="Arial" w:cs="Arial"/>
+          <w:color w:val="000000"/>
+          <w:sz w:val="20"/>
+          <w:szCs w:val="20"/>
+        </w:rPr>
+        <w:t>.</w:t>
+      </w:r>
+    </w:p>
+    <w:p>
+      <w:pPr>
+        <w:pStyle w:val="BodyText"/>
+        <w:spacing w:line="360" w:lineRule="auto"/>
+        <w:ind w:left="567"/>
+        <w:rPr>
+          <w:rFonts w:ascii="Arial" w:hAnsi="Arial" w:cs="Arial"/>
+          <w:color w:val="000000"/>
+          <w:sz w:val="20"/>
+          <w:szCs w:val="20"/>
+          <w:shd w:val="clear" w:color="auto" w:fill="C9D7F1"/>
+        </w:rPr>
+      </w:pPr>
+      <w:r>
+        <w:rPr>
+          <w:rFonts w:ascii="Arial" w:hAnsi="Arial" w:cs="Arial"/>
+          <w:noProof/>
+          <w:color w:val="000000"/>
+          <w:sz w:val="20"/>
+          <w:szCs w:val="20"/>
+        </w:rPr>
+        <w:lastRenderedPageBreak/>
+        <mc:AlternateContent>
+          <mc:Choice Requires="wpg">
+            <w:drawing>
+              <wp:anchor distT="0" distB="0" distL="114300" distR="114300" simplePos="0" relativeHeight="251660288" behindDoc="0" locked="0" layoutInCell="1" allowOverlap="1" wp14:anchorId="5E5BC319" wp14:editId="6AB8B4D6">
+                <wp:simplePos x="0" y="0"/>
+                <wp:positionH relativeFrom="column">
+                  <wp:posOffset>309880</wp:posOffset>
+                </wp:positionH>
+                <wp:positionV relativeFrom="paragraph">
+                  <wp:posOffset>439420</wp:posOffset>
+                </wp:positionV>
+                <wp:extent cx="4333875" cy="2958465"/>
+                <wp:effectExtent l="0" t="0" r="9525" b="0"/>
+                <wp:wrapTopAndBottom/>
+                <wp:docPr id="773292269" name="Group 2"/>
+                <wp:cNvGraphicFramePr/>
+                <a:graphic xmlns:a="http://schemas.openxmlformats.org/drawingml/2006/main">
+                  <a:graphicData uri="http://schemas.microsoft.com/office/word/2010/wordprocessingGroup">
+                    <wpg:wgp>
+                      <wpg:cNvGrpSpPr/>
+                      <wpg:grpSpPr>
+                        <a:xfrm>
+                          <a:off x="0" y="0"/>
+                          <a:ext cx="4333875" cy="2958465"/>
+                          <a:chOff x="0" y="0"/>
+                          <a:chExt cx="4333875" cy="2958465"/>
+                        </a:xfrm>
+                      </wpg:grpSpPr>
+                      <pic:pic xmlns:pic="http://schemas.openxmlformats.org/drawingml/2006/picture">
+                        <pic:nvPicPr>
+                          <pic:cNvPr id="508835530" name="Picture 1"/>
+                          <pic:cNvPicPr>
+                            <a:picLocks noChangeAspect="1"/>
+                          </pic:cNvPicPr>
+                        </pic:nvPicPr>
+                        <pic:blipFill>
+                          <a:blip r:embed="rId11">
+                            <a:extLst>
+                              <a:ext uri="{28A0092B-C50C-407E-A947-70E740481C1C}">
+                                <a14:useLocalDpi xmlns:a14="http://schemas.microsoft.com/office/drawing/2010/main" val="0"/>
+                              </a:ext>
+                            </a:extLst>
+                          </a:blip>
+                          <a:stretch>
+                            <a:fillRect/>
+                          </a:stretch>
+                        </pic:blipFill>
+                        <pic:spPr>
+                          <a:xfrm>
+                            <a:off x="0" y="0"/>
+                            <a:ext cx="4333875" cy="2644775"/>
+                          </a:xfrm>
+                          <a:prstGeom prst="rect">
+                            <a:avLst/>
+                          </a:prstGeom>
+                        </pic:spPr>
+                      </pic:pic>
+                      <wps:wsp>
+                        <wps:cNvPr id="1875469471" name="Text Box 1"/>
+                        <wps:cNvSpPr txBox="1"/>
+                        <wps:spPr>
+                          <a:xfrm>
+                            <a:off x="0" y="2700020"/>
+                            <a:ext cx="4333875" cy="258445"/>
+                          </a:xfrm>
+                          <a:prstGeom prst="rect">
+                            <a:avLst/>
+                          </a:prstGeom>
+                          <a:solidFill>
+                            <a:prstClr val="white"/>
+                          </a:solidFill>
+                          <a:ln>
+                            <a:noFill/>
+                          </a:ln>
+                        </wps:spPr>
+                        <wps:txbx>
+                          <w:txbxContent>
+                            <w:p>
+                              <w:pPr>
+                                <w:pStyle w:val="Caption"/>
+                                <w:jc w:val="center"/>
+                                <w:rPr>
+                                  <w:rFonts w:eastAsiaTheme="minorHAnsi" w:cs="Arial"/>
+                                  <w:noProof/>
+                                  <w:color w:val="000000"/>
+                                  <w:sz w:val="20"/>
+                                  <w:szCs w:val="20"/>
+                                  <w:shd w:val="clear" w:color="auto" w:fill="C9D7F1"/>
+                                </w:rPr>
+                              </w:pPr>
+                              <w:r>
+                                <w:t xml:space="preserve">Figure </w:t>
+                              </w:r>
+                              <w:r>
+                                <w:fldChar w:fldCharType="begin"/>
+                              </w:r>
+                              <w:r>
+                                <w:instrText xml:space="preserve"> SEQ Figure \* ARABIC </w:instrText>
+                              </w:r>
+                              <w:r>
+                                <w:fldChar w:fldCharType="separate"/>
+                              </w:r>
+                              <w:r>
+                                <w:rPr>
+                                  <w:noProof/>
+                                </w:rPr>
+                                <w:t>1</w:t>
+                              </w:r>
+                              <w:r>
+                                <w:fldChar w:fldCharType="end"/>
+                              </w:r>
+                              <w:r>
+                                <w:t>: PBS structure diagram</w:t>
+                              </w:r>
+                            </w:p>
+                          </w:txbxContent>
+                        </wps:txbx>
+                        <wps:bodyPr rot="0" spcFirstLastPara="0" vertOverflow="overflow" horzOverflow="overflow" vert="horz" wrap="square" lIns="0" tIns="0" rIns="0" bIns="0" numCol="1" spcCol="0" rtlCol="0" fromWordArt="0" anchor="t" anchorCtr="0" forceAA="0" compatLnSpc="1">
+                          <a:prstTxWarp prst="textNoShape">
+                            <a:avLst/>
+                          </a:prstTxWarp>
+                          <a:spAutoFit/>
+                        </wps:bodyPr>
+                      </wps:wsp>
+                    </wpg:wgp>
+                  </a:graphicData>
+                </a:graphic>
+              </wp:anchor>
+            </w:drawing>
+          </mc:Choice>
+          <mc:Fallback>
+            <w:pict>
+              <v:group w14:anchorId="5E5BC319" id="Group 2" o:spid="_x0000_s1026" style="position:absolute;left:0;text-align:left;margin-left:24.4pt;margin-top:34.6pt;width:341.25pt;height:232.95pt;z-index:251660288" coordsize="43338,29584" o:gfxdata="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">
+                <v:shapetype id="_x0000_t75" coordsize="21600,21600" o:spt="75" o:preferrelative="t" path="m@4@5l@4@11@9@11@9@5xe" filled="f" stroked="f">
+                  <v:stroke joinstyle="miter"/>
+                  <v:formulas>
+                    <v:f eqn="if lineDrawn pixelLineWidth 0"/>
+                    <v:f eqn="sum @0 1 0"/>
+                    <v:f eqn="sum 0 0 @1"/>
+                    <v:f eqn="prod @2 1 2"/>
+                    <v:f eqn="prod @3 21600 pixelWidth"/>
+                    <v:f eqn="prod @3 21600 pixelHeight"/>
+                    <v:f eqn="sum @0 0 1"/>
+                    <v:f eqn="prod @6 1 2"/>
+                    <v:f eqn="prod @7 21600 pixelWidth"/>
+                    <v:f eqn="sum @8 21600 0"/>
+                    <v:f eqn="prod @7 21600 pixelHeight"/>
+                    <v:f eqn="sum @10 21600 0"/>
+                  </v:formulas>
+                  <v:path o:extrusionok="f" gradientshapeok="t" o:connecttype="rect"/>
+                  <o:lock v:ext="edit" aspectratio="t"/>
+                </v:shapetype>
+                <v:shape id="Picture 1" o:spid="_x0000_s1027" type="#_x0000_t75" style="position:absolute;width:43338;height:26447;visibility:visible;mso-wrap-style:square" o:gfxdata="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">
+                  <v:imagedata r:id="rId12" o:title=""/>
+                </v:shape>
+                <v:shapetype id="_x0000_t202" coordsize="21600,21600" o:spt="202" path="m,l,21600r21600,l21600,xe">
+                  <v:stroke joinstyle="miter"/>
+                  <v:path gradientshapeok="t" o:connecttype="rect"/>
+                </v:shapetype>
+                <v:shape id="Text Box 1" o:spid="_x0000_s1028" type="#_x0000_t202" style="position:absolute;top:27000;width:43338;height:2584;visibility:visible;mso-wrap-style:square;v-text-anchor:top" o:gfxdata="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" stroked="f">
+                  <v:textbox style="mso-fit-shape-to-text:t" inset="0,0,0,0">
+                    <w:txbxContent>
+                      <w:p>
+                        <w:pPr>
+                          <w:pStyle w:val="Caption"/>
+                          <w:jc w:val="center"/>
+                          <w:rPr>
+                            <w:rFonts w:eastAsiaTheme="minorHAnsi" w:cs="Arial"/>
+                            <w:noProof/>
+                            <w:color w:val="000000"/>
+                            <w:sz w:val="20"/>
+                            <w:szCs w:val="20"/>
+                            <w:shd w:val="clear" w:color="auto" w:fill="C9D7F1"/>
+                          </w:rPr>
+                        </w:pPr>
+                        <w:r>
+                          <w:t xml:space="preserve">Figure </w:t>
+                        </w:r>
+                        <w:r>
+                          <w:fldChar w:fldCharType="begin"/>
+                        </w:r>
+                        <w:r>
+                          <w:instrText xml:space="preserve"> SEQ Figure \* ARABIC </w:instrText>
+                        </w:r>
+                        <w:r>
+                          <w:fldChar w:fldCharType="separate"/>
+                        </w:r>
+                        <w:r>
+                          <w:rPr>
+                            <w:noProof/>
+                          </w:rPr>
+                          <w:t>1</w:t>
+                        </w:r>
+                        <w:r>
+                          <w:fldChar w:fldCharType="end"/>
+                        </w:r>
+                        <w:r>
+                          <w:t>: PBS structure diagram</w:t>
+                        </w:r>
+                      </w:p>
+                    </w:txbxContent>
+                  </v:textbox>
+                </v:shape>
+                <w10:wrap type="topAndBottom"/>
+              </v:group>
+            </w:pict>
+          </mc:Fallback>
+        </mc:AlternateContent>
+      </w:r>
+    </w:p>
+    <w:p>
+      <w:pPr>
+        <w:pStyle w:val="BodyText"/>
+      </w:pPr>
+    </w:p>
+    <w:p>
+      <w:pPr>
+        <w:pStyle w:val="BodyText"/>
+      </w:pPr>
+    </w:p>
+    <w:p>
+      <w:pPr>
+        <w:pStyle w:val="Heading2"/>
+        <w:tabs>
+          <w:tab w:val="clear" w:pos="992"/>
+          <w:tab w:val="num" w:pos="851"/>
+        </w:tabs>
+        <w:spacing w:line="360" w:lineRule="auto"/>
+        <w:ind w:left="567" w:hanging="141"/>
+      </w:pPr>
+      <w:bookmarkStart w:id="15" w:name="_Toc89965977"/>
+      <w:bookmarkStart w:id="16" w:name="_Toc327581048"/>
+      <w:bookmarkStart w:id="17" w:name="_Toc327581598"/>
+      <w:bookmarkStart w:id="18" w:name="_Toc327583378"/>
+      <w:r>
+        <w:t>Research questions</w:t>
+      </w:r>
+      <w:bookmarkEnd w:id="15"/>
+      <w:bookmarkEnd w:id="16"/>
+      <w:bookmarkEnd w:id="17"/>
+      <w:bookmarkEnd w:id="18"/>
+    </w:p>
+    <w:p>
+      <w:pPr>
+        <w:pStyle w:val="Heading3"/>
+        <w:tabs>
+          <w:tab w:val="clear" w:pos="709"/>
+          <w:tab w:val="num" w:pos="1276"/>
+        </w:tabs>
+        <w:spacing w:line="360" w:lineRule="auto"/>
+        <w:ind w:left="709" w:firstLine="0"/>
+        <w:rPr>
+          <w:rFonts w:cs="Arial"/>
+          <w:b/>
+          <w:bCs w:val="0"/>
+        </w:rPr>
+      </w:pPr>
+      <w:r>
+        <w:rPr>
+          <w:rFonts w:cs="Arial"/>
+          <w:b/>
+          <w:bCs w:val="0"/>
+        </w:rPr>
+        <w:t>Competitive business model</w:t>
+      </w:r>
+    </w:p>
+    <w:p>
+      <w:pPr>
+        <w:pStyle w:val="ListParagraph"/>
+        <w:numPr>
+          <w:ilvl w:val="3"/>
+          <w:numId w:val="4"/>
+        </w:numPr>
+        <w:tabs>
+          <w:tab w:val="clear" w:pos="1942"/>
+          <w:tab w:val="left" w:pos="1560"/>
+        </w:tabs>
+        <w:spacing w:line="360" w:lineRule="auto"/>
+        <w:ind w:left="993" w:hanging="142"/>
+        <w:jc w:val="both"/>
+        <w:rPr>
+          <w:rFonts w:cs="Arial"/>
+        </w:rPr>
+      </w:pPr>
+      <w:r>
+        <w:rPr>
+          <w:rFonts w:cs="Arial"/>
+        </w:rPr>
+        <w:t xml:space="preserve"> How</w:t>
+      </w:r>
+      <w:r>
+        <w:rPr>
+          <w:rFonts w:cs="Arial"/>
+        </w:rPr>
+        <w:t xml:space="preserve"> do emerging mobility services (e.g. car</w:t>
+      </w:r>
+      <w:r>
+        <w:rPr>
+          <w:rFonts w:ascii="Cambria Math" w:hAnsi="Cambria Math" w:cs="Cambria Math"/>
+        </w:rPr>
+        <w:t>‑</w:t>
+      </w:r>
+      <w:r>
+        <w:rPr>
+          <w:rFonts w:cs="Arial"/>
+        </w:rPr>
+        <w:t>sharing, subscriptions) affect demand for traditional car rental in Dutch urban areas?</w:t>
+      </w:r>
+    </w:p>
+    <w:p>
+      <w:pPr>
+        <w:pStyle w:val="ListParagraph"/>
+        <w:numPr>
+          <w:ilvl w:val="3"/>
+          <w:numId w:val="4"/>
+        </w:numPr>
+        <w:tabs>
+          <w:tab w:val="clear" w:pos="1942"/>
+          <w:tab w:val="left" w:pos="1560"/>
+        </w:tabs>
+        <w:spacing w:line="360" w:lineRule="auto"/>
+        <w:ind w:left="993" w:hanging="142"/>
+        <w:jc w:val="both"/>
+        <w:rPr>
+          <w:rFonts w:cs="Arial"/>
+        </w:rPr>
+      </w:pPr>
+      <w:r>
+        <w:rPr>
+          <w:rFonts w:cs="Arial"/>
+        </w:rPr>
+        <w:t>How does the Dutch rental services adapt to the changing environmental regulations?</w:t>
+      </w:r>
+    </w:p>
+    <w:p>
+      <w:pPr>
+        <w:pStyle w:val="Heading3"/>
+        <w:tabs>
+          <w:tab w:val="clear" w:pos="709"/>
+          <w:tab w:val="num" w:pos="1276"/>
+        </w:tabs>
+        <w:spacing w:line="360" w:lineRule="auto"/>
+        <w:ind w:left="709" w:firstLine="0"/>
+        <w:rPr>
+          <w:b/>
+          <w:bCs w:val="0"/>
+        </w:rPr>
+      </w:pPr>
+      <w:r>
+        <w:rPr>
+          <w:b/>
+          <w:bCs w:val="0"/>
+        </w:rPr>
+        <w:t>Market demand</w:t>
+      </w:r>
+    </w:p>
+    <w:p>
+      <w:pPr>
+        <w:pStyle w:val="ListParagraph"/>
+        <w:numPr>
+          <w:ilvl w:val="3"/>
+          <w:numId w:val="4"/>
+        </w:numPr>
+        <w:tabs>
+          <w:tab w:val="clear" w:pos="1942"/>
+          <w:tab w:val="num" w:pos="1701"/>
+        </w:tabs>
+        <w:spacing w:line="360" w:lineRule="auto"/>
+        <w:ind w:left="1560" w:hanging="709"/>
+      </w:pPr>
+      <w:r>
+        <w:t>What are the main decisions behind a typical rental (tourism, urban needs…).</w:t>
+      </w:r>
+    </w:p>
+    <w:p>
+      <w:pPr>
+        <w:pStyle w:val="Heading3"/>
+        <w:tabs>
+          <w:tab w:val="clear" w:pos="709"/>
+          <w:tab w:val="num" w:pos="1276"/>
+        </w:tabs>
+        <w:spacing w:line="360" w:lineRule="auto"/>
+        <w:ind w:left="709" w:firstLine="0"/>
+        <w:rPr>
+          <w:b/>
+          <w:bCs w:val="0"/>
+        </w:rPr>
+      </w:pPr>
+      <w:r>
+        <w:rPr>
+          <w:b/>
+          <w:bCs w:val="0"/>
+        </w:rPr>
+        <w:t>Service quality &amp; trust</w:t>
+      </w:r>
+    </w:p>
+    <w:p>
+      <w:pPr>
+        <w:pStyle w:val="ListParagraph"/>
+        <w:numPr>
+          <w:ilvl w:val="3"/>
+          <w:numId w:val="4"/>
+        </w:numPr>
+        <w:tabs>
+          <w:tab w:val="clear" w:pos="1942"/>
+          <w:tab w:val="left" w:pos="1560"/>
+        </w:tabs>
+        <w:spacing w:line="360" w:lineRule="auto"/>
+        <w:ind w:left="993" w:hanging="142"/>
+        <w:jc w:val="both"/>
+      </w:pPr>
+      <w:r>
+        <w:t>Which aspects of service quality (</w:t>
+      </w:r>
+      <w:r>
+        <w:t xml:space="preserve">e.g. transparency of fees, vehicle condition, staff </w:t>
+      </w:r>
+      <w:r>
+        <w:t xml:space="preserve">                                                                                  </w:t>
+      </w:r>
+      <w:r>
+        <w:t>behaviour, digital usability</w:t>
+      </w:r>
+      <w:r>
+        <w:t>) affect the most customer satisfaction.</w:t>
+      </w:r>
+    </w:p>
+    <w:p>
+      <w:pPr>
+        <w:pStyle w:val="Heading1"/>
+        <w:tabs>
+          <w:tab w:val="clear" w:pos="709"/>
+          <w:tab w:val="num" w:pos="567"/>
+        </w:tabs>
+        <w:ind w:left="567" w:hanging="567"/>
+      </w:pPr>
+      <w:bookmarkStart w:id="19" w:name="_Toc89965978"/>
+      <w:r>
+        <w:lastRenderedPageBreak/>
+        <w:t>Approach and Planning</w:t>
+      </w:r>
+      <w:bookmarkEnd w:id="19"/>
+    </w:p>
+    <w:p>
+      <w:pPr>
+        <w:pStyle w:val="Heading2"/>
+        <w:tabs>
+          <w:tab w:val="clear" w:pos="992"/>
+          <w:tab w:val="num" w:pos="851"/>
+        </w:tabs>
+        <w:ind w:left="567" w:hanging="141"/>
+      </w:pPr>
+      <w:bookmarkStart w:id="20" w:name="_Toc89965979"/>
+      <w:r>
+        <w:t>A</w:t>
+      </w:r>
+      <w:r>
+        <w:t>pproach</w:t>
+      </w:r>
+      <w:bookmarkEnd w:id="20"/>
+    </w:p>
+    <w:p>
+      <w:pPr>
+        <w:spacing w:line="360" w:lineRule="auto"/>
+        <w:ind w:left="709"/>
+        <w:jc w:val="both"/>
+      </w:pPr>
+      <w:r>
+        <w:rPr>
+          <w:rFonts w:cs="Arial"/>
+          <w:color w:val="000000"/>
+        </w:rPr>
+        <w:t>For this project, I will go for the scrum methodology</w:t>
+      </w:r>
+      <w:r>
+        <w:rPr>
+          <w:rFonts w:cs="Arial"/>
+          <w:color w:val="000000"/>
+        </w:rPr>
+        <w:t>. By following the agile framework, the work would be divided into several sprints and before moving to the next iteration, the previous must have been validated. To keep track of the project’s development progress, I will use a project management system (ClickUp).</w:t>
+      </w:r>
+    </w:p>
+    <w:p>
+      <w:pPr>
+        <w:pStyle w:val="Heading3"/>
+      </w:pPr>
+      <w:r>
+        <w:t>Test</w:t>
+      </w:r>
+      <w:r>
+        <w:t xml:space="preserve"> approach</w:t>
+      </w:r>
+    </w:p>
+    <w:p>
+      <w:pPr>
         <w:rPr>
           <w:rFonts w:cs="Arial"/>
           <w:i/>
@@ -2000,142 +2769,6 @@
           <w:sz w:val="16"/>
           <w:szCs w:val="16"/>
         </w:rPr>
-        <w:t>&lt;&lt; Indicate, where necessary, what the preconditions are. For example, consider technology set by the company. Note that a critical attitude remains important here!&gt;&gt;</w:t>
-      </w:r>
-    </w:p>
-    <w:p/>
-    <w:p>
-      <w:pPr>
-        <w:pStyle w:val="Heading2"/>
-        <w:tabs>
-          <w:tab w:val="clear" w:pos="992"/>
-          <w:tab w:val="num" w:pos="709"/>
-        </w:tabs>
-        <w:ind w:left="709"/>
-      </w:pPr>
-      <w:bookmarkStart w:id="15" w:name="_Toc89965976"/>
-      <w:r>
-        <w:t>Finished products</w:t>
-      </w:r>
-      <w:bookmarkEnd w:id="15"/>
-    </w:p>
-    <w:p>
-      <w:pPr>
-        <w:pStyle w:val="BodyText"/>
-        <w:rPr>
-          <w:rFonts w:ascii="Arial" w:hAnsi="Arial" w:cs="Arial"/>
-          <w:i/>
-          <w:iCs/>
-          <w:color w:val="000000"/>
-          <w:sz w:val="16"/>
-          <w:szCs w:val="16"/>
-          <w:shd w:val="clear" w:color="auto" w:fill="C9D7F1"/>
-        </w:rPr>
-      </w:pPr>
-      <w:r>
-        <w:rPr>
-          <w:rFonts w:ascii="Arial" w:hAnsi="Arial" w:cs="Arial"/>
-          <w:i/>
-          <w:iCs/>
-          <w:color w:val="000000"/>
-          <w:sz w:val="16"/>
-          <w:szCs w:val="16"/>
-        </w:rPr>
-        <w:t xml:space="preserve">&lt;&lt;A Product Breakdown Structure of the end and intermediate products that the project will deliver with a short description in text of each product. The end products are more than the project plan and the product itself. Also, for example, requirements and architecture documents and research and test reports are typical parts of a PBS. These documents are important for the relevant stakeholders during development as well as during the transfer and during the management phase. During the project you can change </w:t>
-      </w:r>
-      <w:r>
-        <w:rPr>
-          <w:rFonts w:ascii="Arial" w:hAnsi="Arial" w:cs="Arial"/>
-          <w:i/>
-          <w:iCs/>
-          <w:color w:val="000000"/>
-          <w:sz w:val="16"/>
-          <w:szCs w:val="16"/>
-        </w:rPr>
-        <w:t xml:space="preserve">the </w:t>
-      </w:r>
-      <w:proofErr w:type="gramStart"/>
-      <w:r>
-        <w:rPr>
-          <w:rFonts w:ascii="Arial" w:hAnsi="Arial" w:cs="Arial"/>
-          <w:i/>
-          <w:iCs/>
-          <w:color w:val="000000"/>
-          <w:sz w:val="16"/>
-          <w:szCs w:val="16"/>
-        </w:rPr>
-        <w:t>PBS</w:t>
-      </w:r>
-      <w:proofErr w:type="gramEnd"/>
-      <w:r>
-        <w:rPr>
-          <w:rFonts w:ascii="Arial" w:hAnsi="Arial" w:cs="Arial"/>
-          <w:i/>
-          <w:iCs/>
-          <w:color w:val="000000"/>
-          <w:sz w:val="16"/>
-          <w:szCs w:val="16"/>
-        </w:rPr>
-        <w:t xml:space="preserve"> and you can add or remove products in consultation. &gt;&gt;</w:t>
-      </w:r>
-    </w:p>
-    <w:p>
-      <w:pPr>
-        <w:pStyle w:val="BodyText"/>
-      </w:pPr>
-      <w:r>
-        <w:object w:dxaOrig="8925" w:dyaOrig="5190" w14:anchorId="3C3BB758">
-          <v:shapetype id="_x0000_t75" coordsize="21600,21600" o:spt="75" o:preferrelative="t" path="m@4@5l@4@11@9@11@9@5xe" filled="f" stroked="f">
-            <v:stroke joinstyle="miter"/>
-            <v:formulas>
-              <v:f eqn="if lineDrawn pixelLineWidth 0"/>
-              <v:f eqn="sum @0 1 0"/>
-              <v:f eqn="sum 0 0 @1"/>
-              <v:f eqn="prod @2 1 2"/>
-              <v:f eqn="prod @3 21600 pixelWidth"/>
-              <v:f eqn="prod @3 21600 pixelHeight"/>
-              <v:f eqn="sum @0 0 1"/>
-              <v:f eqn="prod @6 1 2"/>
-              <v:f eqn="prod @7 21600 pixelWidth"/>
-              <v:f eqn="sum @8 21600 0"/>
-              <v:f eqn="prod @7 21600 pixelHeight"/>
-              <v:f eqn="sum @10 21600 0"/>
-            </v:formulas>
-            <v:path o:extrusionok="f" gradientshapeok="t" o:connecttype="rect"/>
-            <o:lock v:ext="edit" aspectratio="t"/>
-          </v:shapetype>
-          <v:shape id="_x0000_i1025" type="#_x0000_t75" style="width:348pt;height:202.5pt" o:ole="">
-            <v:imagedata r:id="rId10" o:title=""/>
-          </v:shape>
-          <o:OLEObject Type="Embed" ProgID="OrgPlusWOPX.4" ShapeID="_x0000_i1025" DrawAspect="Content" ObjectID="_1834151099" r:id="rId11"/>
-        </w:object>
-      </w:r>
-    </w:p>
-    <w:p>
-      <w:pPr>
-        <w:pStyle w:val="Heading2"/>
-        <w:ind w:left="0" w:firstLine="0"/>
-      </w:pPr>
-      <w:bookmarkStart w:id="16" w:name="_Toc89965977"/>
-      <w:bookmarkStart w:id="17" w:name="_Toc327581048"/>
-      <w:bookmarkStart w:id="18" w:name="_Toc327581598"/>
-      <w:bookmarkStart w:id="19" w:name="_Toc327583378"/>
-      <w:r>
-        <w:t>Research questions</w:t>
-      </w:r>
-      <w:bookmarkEnd w:id="16"/>
-    </w:p>
-    <w:bookmarkEnd w:id="17"/>
-    <w:bookmarkEnd w:id="18"/>
-    <w:bookmarkEnd w:id="19"/>
-    <w:p>
-      <w:pPr>
-        <w:rPr>
-          <w:i/>
-          <w:iCs/>
-          <w:sz w:val="16"/>
-          <w:szCs w:val="16"/>
-        </w:rPr>
       </w:pPr>
       <w:r>
         <w:rPr>
@@ -2146,46 +2779,10 @@
           <w:sz w:val="16"/>
           <w:szCs w:val="16"/>
         </w:rPr>
-        <w:t xml:space="preserve">&lt;&lt;Describe the most important research questions you want to answer during your internship. Define a main question with sub-questions derived from it. Keep in mind that you will be doing investigative work during your entire internship, and that your questions will therefore concern your entire trajectory. During your internship/graduation, more research questions may be of interest and others may turn out to be less relevant. Describe only the key research questions that will have the greatest impact on </w:t>
-      </w:r>
-      <w:r>
-        <w:rPr>
-          <w:rFonts w:cs="Arial"/>
-          <w:i/>
-          <w:iCs/>
-          <w:color w:val="000000"/>
-          <w:sz w:val="16"/>
-          <w:szCs w:val="16"/>
-        </w:rPr>
-        <w:lastRenderedPageBreak/>
-        <w:t>your project. Other research aspects can be elaborated in more detail during your internship and can then be explained with a short substantiation (in your portfolio or orally). &gt;&gt;</w:t>
-      </w:r>
-    </w:p>
-    <w:p>
-      <w:pPr>
-        <w:tabs>
-          <w:tab w:val="left" w:pos="2127"/>
-          <w:tab w:val="left" w:pos="2410"/>
-        </w:tabs>
-        <w:ind w:left="2410" w:hanging="2410"/>
-      </w:pPr>
-    </w:p>
-    <w:p>
-      <w:pPr>
-        <w:pStyle w:val="BodyText"/>
-      </w:pPr>
-    </w:p>
-    <w:p>
-      <w:pPr>
-        <w:pStyle w:val="Heading1"/>
-      </w:pPr>
-      <w:bookmarkStart w:id="20" w:name="_Toc89965978"/>
-      <w:r>
-        <w:lastRenderedPageBreak/>
-        <w:t>Approach and Planning</w:t>
-      </w:r>
-      <w:bookmarkEnd w:id="20"/>
-    </w:p>
+        <w:t>&lt;&lt;If applicable: how is testing designed. What is the approach? And why? Also include any approach to (Code) reviews in this&gt;&gt;</w:t>
+      </w:r>
+    </w:p>
+    <w:p/>
     <w:p>
       <w:pPr>
         <w:pStyle w:val="Heading2"/>
@@ -2195,94 +2792,21 @@
         </w:tabs>
         <w:ind w:left="709"/>
       </w:pPr>
-      <w:bookmarkStart w:id="21" w:name="_Toc89965979"/>
-      <w:r>
-        <w:t>A</w:t>
-      </w:r>
-      <w:r>
-        <w:t>pproach</w:t>
+      <w:bookmarkStart w:id="21" w:name="_Toc89965980"/>
+      <w:bookmarkStart w:id="22" w:name="_Toc327581054"/>
+      <w:bookmarkStart w:id="23" w:name="_Toc327581604"/>
+      <w:bookmarkStart w:id="24" w:name="_Toc327583384"/>
+      <w:bookmarkStart w:id="25" w:name="_Toc339966123"/>
+      <w:r>
+        <w:t xml:space="preserve">Research </w:t>
+      </w:r>
+      <w:r>
+        <w:t>method</w:t>
+      </w:r>
+      <w:r>
+        <w:t>s</w:t>
       </w:r>
       <w:bookmarkEnd w:id="21"/>
-    </w:p>
-    <w:p>
-      <w:pPr>
-        <w:rPr>
-          <w:i/>
-          <w:sz w:val="16"/>
-          <w:szCs w:val="16"/>
-        </w:rPr>
-      </w:pPr>
-      <w:r>
-        <w:rPr>
-          <w:rFonts w:cs="Arial"/>
-          <w:i/>
-          <w:iCs/>
-          <w:color w:val="000000"/>
-          <w:sz w:val="16"/>
-          <w:szCs w:val="16"/>
-        </w:rPr>
-        <w:t>&lt;&lt; Indicate here which method you follow in your project plan, for example whether you use a waterfall or scrum method. Also indicate how you will approach the problem definition phase and completion phase. With a scrum approach you can think of length of sprints, set-up of your sprints, stand-up, set-up of demos, retrospective, etc.)&gt;&gt;.</w:t>
-      </w:r>
-    </w:p>
-    <w:p>
-      <w:pPr>
-        <w:pStyle w:val="Heading3"/>
-      </w:pPr>
-      <w:r>
-        <w:t>Test</w:t>
-      </w:r>
-      <w:r>
-        <w:t xml:space="preserve"> approach</w:t>
-      </w:r>
-    </w:p>
-    <w:p>
-      <w:pPr>
-        <w:rPr>
-          <w:rFonts w:cs="Arial"/>
-          <w:i/>
-          <w:iCs/>
-          <w:color w:val="000000"/>
-          <w:sz w:val="16"/>
-          <w:szCs w:val="16"/>
-        </w:rPr>
-      </w:pPr>
-      <w:r>
-        <w:rPr>
-          <w:rFonts w:cs="Arial"/>
-          <w:i/>
-          <w:iCs/>
-          <w:color w:val="000000"/>
-          <w:sz w:val="16"/>
-          <w:szCs w:val="16"/>
-        </w:rPr>
-        <w:t>&lt;&lt;If applicable: how is testing designed. What is the approach? And why? Also include any approach to (Code) reviews in this&gt;&gt;</w:t>
-      </w:r>
-    </w:p>
-    <w:p/>
-    <w:p>
-      <w:pPr>
-        <w:pStyle w:val="Heading2"/>
-        <w:tabs>
-          <w:tab w:val="clear" w:pos="992"/>
-          <w:tab w:val="num" w:pos="709"/>
-        </w:tabs>
-        <w:ind w:left="709"/>
-      </w:pPr>
-      <w:bookmarkStart w:id="22" w:name="_Toc89965980"/>
-      <w:bookmarkStart w:id="23" w:name="_Toc327581054"/>
-      <w:bookmarkStart w:id="24" w:name="_Toc327581604"/>
-      <w:bookmarkStart w:id="25" w:name="_Toc327583384"/>
-      <w:bookmarkStart w:id="26" w:name="_Toc339966123"/>
-      <w:r>
-        <w:t xml:space="preserve">Research </w:t>
-      </w:r>
-      <w:r>
-        <w:t>method</w:t>
-      </w:r>
-      <w:r>
-        <w:t>s</w:t>
-      </w:r>
-      <w:bookmarkEnd w:id="22"/>
     </w:p>
     <w:p>
       <w:pPr>
@@ -2350,11 +2874,11 @@
         </w:tabs>
         <w:ind w:left="709"/>
       </w:pPr>
-      <w:bookmarkStart w:id="27" w:name="_Toc89965981"/>
+      <w:bookmarkStart w:id="26" w:name="_Toc89965981"/>
+      <w:bookmarkEnd w:id="22"/>
       <w:bookmarkEnd w:id="23"/>
       <w:bookmarkEnd w:id="24"/>
       <w:bookmarkEnd w:id="25"/>
-      <w:bookmarkEnd w:id="26"/>
       <w:r>
         <w:t>Learning outcomes</w:t>
       </w:r>
@@ -2409,7 +2933,7 @@
       <w:r>
         <w:t>Breakdown of the project</w:t>
       </w:r>
-      <w:bookmarkEnd w:id="27"/>
+      <w:bookmarkEnd w:id="26"/>
     </w:p>
     <w:p>
       <w:pPr>
@@ -2465,22 +2989,22 @@
         </w:tabs>
         <w:ind w:left="709"/>
       </w:pPr>
-      <w:bookmarkStart w:id="28" w:name="_Toc327581055"/>
-      <w:bookmarkStart w:id="29" w:name="_Toc327581605"/>
-      <w:bookmarkStart w:id="30" w:name="_Toc327583385"/>
-      <w:bookmarkStart w:id="31" w:name="_Toc339966124"/>
-      <w:bookmarkStart w:id="32" w:name="_Toc89965982"/>
+      <w:bookmarkStart w:id="27" w:name="_Toc327581055"/>
+      <w:bookmarkStart w:id="28" w:name="_Toc327581605"/>
+      <w:bookmarkStart w:id="29" w:name="_Toc327583385"/>
+      <w:bookmarkStart w:id="30" w:name="_Toc339966124"/>
+      <w:bookmarkStart w:id="31" w:name="_Toc89965982"/>
       <w:r>
         <w:t>T</w:t>
       </w:r>
+      <w:bookmarkEnd w:id="27"/>
       <w:bookmarkEnd w:id="28"/>
       <w:bookmarkEnd w:id="29"/>
       <w:bookmarkEnd w:id="30"/>
+      <w:r>
+        <w:t>ime plan</w:t>
+      </w:r>
       <w:bookmarkEnd w:id="31"/>
-      <w:r>
-        <w:t>ime plan</w:t>
-      </w:r>
-      <w:bookmarkEnd w:id="32"/>
     </w:p>
     <w:p>
       <w:pPr>
@@ -2502,33 +3026,7 @@
           <w:szCs w:val="16"/>
           <w:lang w:eastAsia="nl-NL"/>
         </w:rPr>
-        <w:t xml:space="preserve">&lt;&lt; Depending on your project method, you will be able to work out the phasing in </w:t>
-      </w:r>
-      <w:proofErr w:type="gramStart"/>
-      <w:r>
-        <w:rPr>
-          <w:rFonts w:cs="Arial"/>
-          <w:i/>
-          <w:iCs/>
-          <w:color w:val="000000"/>
-          <w:sz w:val="16"/>
-          <w:szCs w:val="16"/>
-          <w:lang w:eastAsia="nl-NL"/>
-        </w:rPr>
-        <w:t>more or less detail</w:t>
-      </w:r>
-      <w:proofErr w:type="gramEnd"/>
-      <w:r>
-        <w:rPr>
-          <w:rFonts w:cs="Arial"/>
-          <w:i/>
-          <w:iCs/>
-          <w:color w:val="000000"/>
-          <w:sz w:val="16"/>
-          <w:szCs w:val="16"/>
-          <w:lang w:eastAsia="nl-NL"/>
-        </w:rPr>
-        <w:t>. Below is a possible table that you can use for this.</w:t>
+        <w:t>&lt;&lt; Depending on your project method, you will be able to work out the phasing in more or less detail. Below is a possible table that you can use for this.</w:t>
       </w:r>
     </w:p>
     <w:p>
@@ -2910,30 +3408,30 @@
       </w:tr>
     </w:tbl>
     <w:p>
-      <w:bookmarkStart w:id="33" w:name="_Toc327581056"/>
-      <w:bookmarkStart w:id="34" w:name="_Toc327581606"/>
-      <w:bookmarkStart w:id="35" w:name="_Toc327583386"/>
+      <w:bookmarkStart w:id="32" w:name="_Toc327581056"/>
+      <w:bookmarkStart w:id="33" w:name="_Toc327581606"/>
+      <w:bookmarkStart w:id="34" w:name="_Toc327583386"/>
     </w:p>
     <w:p>
       <w:pPr>
         <w:pStyle w:val="Heading1"/>
       </w:pPr>
-      <w:bookmarkStart w:id="36" w:name="_Toc327581061"/>
-      <w:bookmarkStart w:id="37" w:name="_Toc327581611"/>
-      <w:bookmarkStart w:id="38" w:name="_Toc327583391"/>
-      <w:bookmarkStart w:id="39" w:name="_Toc339966130"/>
-      <w:bookmarkStart w:id="40" w:name="_Toc327581050"/>
-      <w:bookmarkStart w:id="41" w:name="_Toc327581600"/>
-      <w:bookmarkStart w:id="42" w:name="_Toc327583380"/>
-      <w:bookmarkStart w:id="43" w:name="_Toc339966119"/>
-      <w:bookmarkStart w:id="44" w:name="_Toc89965983"/>
+      <w:bookmarkStart w:id="35" w:name="_Toc327581061"/>
+      <w:bookmarkStart w:id="36" w:name="_Toc327581611"/>
+      <w:bookmarkStart w:id="37" w:name="_Toc327583391"/>
+      <w:bookmarkStart w:id="38" w:name="_Toc339966130"/>
+      <w:bookmarkStart w:id="39" w:name="_Toc327581050"/>
+      <w:bookmarkStart w:id="40" w:name="_Toc327581600"/>
+      <w:bookmarkStart w:id="41" w:name="_Toc327583380"/>
+      <w:bookmarkStart w:id="42" w:name="_Toc339966119"/>
+      <w:bookmarkStart w:id="43" w:name="_Toc89965983"/>
+      <w:bookmarkEnd w:id="32"/>
       <w:bookmarkEnd w:id="33"/>
       <w:bookmarkEnd w:id="34"/>
       <w:bookmarkEnd w:id="35"/>
       <w:bookmarkEnd w:id="36"/>
       <w:bookmarkEnd w:id="37"/>
       <w:bookmarkEnd w:id="38"/>
-      <w:bookmarkEnd w:id="39"/>
       <w:r>
         <w:lastRenderedPageBreak/>
         <w:t>Project</w:t>
@@ -2947,14 +3445,14 @@
       <w:r>
         <w:t>rgani</w:t>
       </w:r>
+      <w:bookmarkEnd w:id="39"/>
       <w:bookmarkEnd w:id="40"/>
       <w:bookmarkEnd w:id="41"/>
       <w:bookmarkEnd w:id="42"/>
+      <w:r>
+        <w:t>zation</w:t>
+      </w:r>
       <w:bookmarkEnd w:id="43"/>
-      <w:r>
-        <w:t>zation</w:t>
-      </w:r>
-      <w:bookmarkEnd w:id="44"/>
     </w:p>
     <w:p>
       <w:pPr>
@@ -2965,24 +3463,24 @@
         </w:tabs>
         <w:ind w:left="709"/>
       </w:pPr>
-      <w:bookmarkStart w:id="45" w:name="_Toc327581051"/>
-      <w:bookmarkStart w:id="46" w:name="_Toc327581601"/>
-      <w:bookmarkStart w:id="47" w:name="_Toc327583381"/>
-      <w:bookmarkStart w:id="48" w:name="_Toc339966120"/>
-      <w:bookmarkStart w:id="49" w:name="_Toc480254627"/>
-      <w:bookmarkStart w:id="50" w:name="_Toc89965984"/>
+      <w:bookmarkStart w:id="44" w:name="_Toc327581051"/>
+      <w:bookmarkStart w:id="45" w:name="_Toc327581601"/>
+      <w:bookmarkStart w:id="46" w:name="_Toc327583381"/>
+      <w:bookmarkStart w:id="47" w:name="_Toc339966120"/>
+      <w:bookmarkStart w:id="48" w:name="_Toc480254627"/>
+      <w:bookmarkStart w:id="49" w:name="_Toc89965984"/>
       <w:r>
         <w:t>Team</w:t>
       </w:r>
+      <w:bookmarkEnd w:id="44"/>
       <w:bookmarkEnd w:id="45"/>
       <w:bookmarkEnd w:id="46"/>
       <w:bookmarkEnd w:id="47"/>
       <w:bookmarkEnd w:id="48"/>
+      <w:r>
+        <w:t xml:space="preserve"> members</w:t>
+      </w:r>
       <w:bookmarkEnd w:id="49"/>
-      <w:r>
-        <w:t xml:space="preserve"> members</w:t>
-      </w:r>
-      <w:bookmarkEnd w:id="50"/>
     </w:p>
     <w:p>
       <w:pPr>
@@ -3000,27 +3498,7 @@
           <w:sz w:val="16"/>
           <w:szCs w:val="16"/>
         </w:rPr>
-        <w:t>&lt;&lt; Describe the organization of the project with its immediate environment. An organization chart can be displayed for clarification. Indicate in descriptive form which roles are included in the organization chart with the associated authorities and responsibilities. It must be clear who is authorized to do what and what can be expected of whom. Indicate who is involved in your project and what his/her function is and what the role is within your project. For example, someone with the function 'manager of department X' can have the role of Product Owner in your project. In this project, both the internship/graduation organization and Fontys are stakeholders. </w:t>
-      </w:r>
-      <w:proofErr w:type="gramStart"/>
-      <w:r>
-        <w:rPr>
-          <w:i/>
-          <w:iCs/>
-          <w:sz w:val="16"/>
-          <w:szCs w:val="16"/>
-        </w:rPr>
-        <w:t>So</w:t>
-      </w:r>
-      <w:proofErr w:type="gramEnd"/>
-      <w:r>
-        <w:rPr>
-          <w:i/>
-          <w:iCs/>
-          <w:sz w:val="16"/>
-          <w:szCs w:val="16"/>
-        </w:rPr>
-        <w:t xml:space="preserve"> include your internship teachers and yourself in this schedule.&gt;&gt;</w:t>
+        <w:t>&lt;&lt; Describe the organization of the project with its immediate environment. An organization chart can be displayed for clarification. Indicate in descriptive form which roles are included in the organization chart with the associated authorities and responsibilities. It must be clear who is authorized to do what and what can be expected of whom. Indicate who is involved in your project and what his/her function is and what the role is within your project. For example, someone with the function 'manager of department X' can have the role of Product Owner in your project. In this project, both the internship/graduation organization and Fontys are stakeholders. So include your internship teachers and yourself in this schedule.&gt;&gt;</w:t>
       </w:r>
     </w:p>
     <w:p>
@@ -3352,14 +3830,14 @@
         </w:tabs>
         <w:ind w:left="709"/>
       </w:pPr>
-      <w:bookmarkStart w:id="51" w:name="_Toc89965985"/>
+      <w:bookmarkStart w:id="50" w:name="_Toc89965985"/>
       <w:r>
         <w:t>Communicati</w:t>
       </w:r>
       <w:r>
         <w:t>on</w:t>
       </w:r>
-      <w:bookmarkEnd w:id="51"/>
+      <w:bookmarkEnd w:id="50"/>
     </w:p>
     <w:p>
       <w:pPr>
@@ -3379,55 +3857,7 @@
           <w:sz w:val="16"/>
           <w:szCs w:val="16"/>
         </w:rPr>
-        <w:t>&lt;&lt; Indicate which communication/</w:t>
-      </w:r>
-      <w:proofErr w:type="spellStart"/>
-      <w:r>
-        <w:rPr>
-          <w:rFonts w:cs="Arial"/>
-          <w:i/>
-          <w:iCs/>
-          <w:color w:val="000000"/>
-          <w:sz w:val="16"/>
-          <w:szCs w:val="16"/>
-        </w:rPr>
-        <w:t>attunements</w:t>
-      </w:r>
-      <w:proofErr w:type="spellEnd"/>
-      <w:r>
-        <w:rPr>
-          <w:rFonts w:cs="Arial"/>
-          <w:i/>
-          <w:iCs/>
-          <w:color w:val="000000"/>
-          <w:sz w:val="16"/>
-          <w:szCs w:val="16"/>
-        </w:rPr>
-        <w:t xml:space="preserve"> there are. Think of coordination with company supervisor, teacher supervisor and other stakeholders. How and how often do these </w:t>
-      </w:r>
-      <w:proofErr w:type="spellStart"/>
-      <w:r>
-        <w:rPr>
-          <w:rFonts w:cs="Arial"/>
-          <w:i/>
-          <w:iCs/>
-          <w:color w:val="000000"/>
-          <w:sz w:val="16"/>
-          <w:szCs w:val="16"/>
-        </w:rPr>
-        <w:t>attunements</w:t>
-      </w:r>
-      <w:proofErr w:type="spellEnd"/>
-      <w:r>
-        <w:rPr>
-          <w:rFonts w:cs="Arial"/>
-          <w:i/>
-          <w:iCs/>
-          <w:color w:val="000000"/>
-          <w:sz w:val="16"/>
-          <w:szCs w:val="16"/>
-        </w:rPr>
-        <w:t xml:space="preserve"> take place?&gt;&gt;</w:t>
+        <w:t>&lt;&lt; Indicate which communication/attunements there are. Think of coordination with company supervisor, teacher supervisor and other stakeholders. How and how often do these attunements take place?&gt;&gt;</w:t>
       </w:r>
     </w:p>
     <w:p>
@@ -3449,18 +3879,18 @@
         </w:tabs>
         <w:ind w:left="709"/>
       </w:pPr>
-      <w:bookmarkStart w:id="52" w:name="_Toc89965986"/>
-      <w:bookmarkStart w:id="53" w:name="_Toc327581062"/>
-      <w:bookmarkStart w:id="54" w:name="_Toc327581612"/>
-      <w:bookmarkStart w:id="55" w:name="_Toc327583392"/>
-      <w:bookmarkStart w:id="56" w:name="_Toc339966131"/>
+      <w:bookmarkStart w:id="51" w:name="_Toc89965986"/>
+      <w:bookmarkStart w:id="52" w:name="_Toc327581062"/>
+      <w:bookmarkStart w:id="53" w:name="_Toc327581612"/>
+      <w:bookmarkStart w:id="54" w:name="_Toc327583392"/>
+      <w:bookmarkStart w:id="55" w:name="_Toc339966131"/>
       <w:r>
         <w:t>Test</w:t>
       </w:r>
       <w:r>
         <w:t xml:space="preserve"> environment</w:t>
       </w:r>
-      <w:bookmarkEnd w:id="52"/>
+      <w:bookmarkEnd w:id="51"/>
     </w:p>
     <w:p>
       <w:pPr>
@@ -3580,9 +4010,58 @@
           <w:szCs w:val="16"/>
           <w:lang w:eastAsia="nl-NL"/>
         </w:rPr>
-        <w:t>&lt;&lt;Describe which products are included in the test environment. These can be products that the project produces, but also external products that are necessary to perform the test approach (e.g. computers</w:t>
-      </w:r>
-      <w:proofErr w:type="gramStart"/>
+        <w:t>&lt;&lt;Describe which products are included in the test environment. These can be products that the project produces, but also external products that are necessary to perform the test approach (e.g. computers) </w:t>
+      </w:r>
+      <w:r>
+        <w:rPr>
+          <w:rFonts w:cs="Arial"/>
+          <w:i/>
+          <w:iCs/>
+          <w:color w:val="000000"/>
+          <w:lang w:eastAsia="nl-NL"/>
+        </w:rPr>
+        <w:t>.&gt;&gt;</w:t>
+      </w:r>
+    </w:p>
+    <w:p>
+      <w:pPr>
+        <w:rPr>
+          <w:i/>
+        </w:rPr>
+      </w:pPr>
+    </w:p>
+    <w:p>
+      <w:pPr>
+        <w:pStyle w:val="Heading2"/>
+        <w:tabs>
+          <w:tab w:val="clear" w:pos="992"/>
+          <w:tab w:val="num" w:pos="709"/>
+        </w:tabs>
+        <w:ind w:left="709"/>
+      </w:pPr>
+      <w:bookmarkStart w:id="56" w:name="_Toc89965987"/>
+      <w:bookmarkEnd w:id="52"/>
+      <w:bookmarkEnd w:id="53"/>
+      <w:bookmarkEnd w:id="54"/>
+      <w:bookmarkEnd w:id="55"/>
+      <w:r>
+        <w:t xml:space="preserve">Configuration </w:t>
+      </w:r>
+      <w:r>
+        <w:t>management</w:t>
+      </w:r>
+      <w:bookmarkEnd w:id="56"/>
+    </w:p>
+    <w:p>
+      <w:pPr>
+        <w:rPr>
+          <w:rFonts w:cs="Arial"/>
+          <w:color w:val="000000"/>
+          <w:sz w:val="16"/>
+          <w:szCs w:val="16"/>
+          <w:lang w:eastAsia="nl-NL"/>
+        </w:rPr>
+      </w:pPr>
       <w:r>
         <w:rPr>
           <w:rFonts w:cs="Arial"/>
@@ -3593,58 +4072,8 @@
           <w:szCs w:val="16"/>
           <w:lang w:eastAsia="nl-NL"/>
         </w:rPr>
-        <w:t>) </w:t>
-      </w:r>
-      <w:r>
-        <w:rPr>
-          <w:rFonts w:cs="Arial"/>
-          <w:i/>
-          <w:iCs/>
-          <w:color w:val="000000"/>
-          <w:lang w:eastAsia="nl-NL"/>
-        </w:rPr>
-        <w:t>.</w:t>
-      </w:r>
-      <w:proofErr w:type="gramEnd"/>
-      <w:r>
-        <w:rPr>
-          <w:rFonts w:cs="Arial"/>
-          <w:i/>
-          <w:iCs/>
-          <w:color w:val="000000"/>
-          <w:lang w:eastAsia="nl-NL"/>
-        </w:rPr>
-        <w:t>&gt;&gt;</w:t>
-      </w:r>
-    </w:p>
-    <w:p>
-      <w:pPr>
-        <w:rPr>
-          <w:i/>
-        </w:rPr>
-      </w:pPr>
-    </w:p>
-    <w:p>
-      <w:pPr>
-        <w:pStyle w:val="Heading2"/>
-        <w:tabs>
-          <w:tab w:val="clear" w:pos="992"/>
-          <w:tab w:val="num" w:pos="709"/>
-        </w:tabs>
-        <w:ind w:left="709"/>
-      </w:pPr>
-      <w:bookmarkStart w:id="57" w:name="_Toc89965987"/>
-      <w:bookmarkEnd w:id="53"/>
-      <w:bookmarkEnd w:id="54"/>
-      <w:bookmarkEnd w:id="55"/>
-      <w:bookmarkEnd w:id="56"/>
-      <w:r>
-        <w:t xml:space="preserve">Configuration </w:t>
-      </w:r>
-      <w:r>
-        <w:t>management</w:t>
-      </w:r>
-      <w:bookmarkEnd w:id="57"/>
+        <w:t>&lt;&lt;omit this section if not applicable&gt;&gt;</w:t>
+      </w:r>
     </w:p>
     <w:p>
       <w:pPr>
@@ -3666,7 +4095,7 @@
           <w:szCs w:val="16"/>
           <w:lang w:eastAsia="nl-NL"/>
         </w:rPr>
-        <w:t>&lt;&lt;omit this section if not applicable&gt;&gt;</w:t>
+        <w:t> </w:t>
       </w:r>
     </w:p>
     <w:p>
@@ -3689,29 +4118,6 @@
           <w:szCs w:val="16"/>
           <w:lang w:eastAsia="nl-NL"/>
         </w:rPr>
-        <w:t> </w:t>
-      </w:r>
-    </w:p>
-    <w:p>
-      <w:pPr>
-        <w:rPr>
-          <w:rFonts w:cs="Arial"/>
-          <w:color w:val="000000"/>
-          <w:sz w:val="16"/>
-          <w:szCs w:val="16"/>
-          <w:lang w:eastAsia="nl-NL"/>
-        </w:rPr>
-      </w:pPr>
-      <w:r>
-        <w:rPr>
-          <w:rFonts w:cs="Arial"/>
-          <w:i/>
-          <w:iCs/>
-          <w:color w:val="000000"/>
-          <w:sz w:val="16"/>
-          <w:szCs w:val="16"/>
-          <w:lang w:eastAsia="nl-NL"/>
-        </w:rPr>
         <w:t>&lt;&lt;Describe how the archive is set up (for example your GIT repository structure with branching strategy). Pictures about, for example, your branching strategy can help with this. If possible, describe which baselines and releases you foresee.&gt;</w:t>
       </w:r>
       <w:r>
@@ -3734,12 +4140,12 @@
       </w:pPr>
     </w:p>
     <w:sectPr>
-      <w:headerReference w:type="even" r:id="rId12"/>
-      <w:headerReference w:type="default" r:id="rId13"/>
-      <w:footerReference w:type="even" r:id="rId14"/>
-      <w:footerReference w:type="default" r:id="rId15"/>
-      <w:headerReference w:type="first" r:id="rId16"/>
-      <w:footerReference w:type="first" r:id="rId17"/>
+      <w:headerReference w:type="even" r:id="rId13"/>
+      <w:headerReference w:type="default" r:id="rId14"/>
+      <w:footerReference w:type="even" r:id="rId15"/>
+      <w:footerReference w:type="default" r:id="rId16"/>
+      <w:headerReference w:type="first" r:id="rId17"/>
+      <w:footerReference w:type="first" r:id="rId18"/>
       <w:pgSz w:w="11906" w:h="16838"/>
       <w:pgMar w:top="1948" w:right="1183" w:bottom="1702" w:left="1417" w:header="708" w:footer="708" w:gutter="0"/>
       <w:pgNumType w:start="1"/>
@@ -3796,23 +4202,21 @@
         <w:szCs w:val="16"/>
       </w:rPr>
     </w:pPr>
-    <w:proofErr w:type="spellStart"/>
     <w:r>
       <w:rPr>
         <w:color w:val="82838A"/>
         <w:sz w:val="16"/>
         <w:szCs w:val="16"/>
       </w:rPr>
-      <w:t>Documentnaam</w:t>
+      <w:t xml:space="preserve">Documentnaam: </w:t>
     </w:r>
-    <w:proofErr w:type="spellEnd"/>
     <w:r>
       <w:rPr>
         <w:color w:val="82838A"/>
         <w:sz w:val="16"/>
         <w:szCs w:val="16"/>
       </w:rPr>
-      <w:t xml:space="preserve">: </w:t>
+      <w:fldChar w:fldCharType="begin"/>
     </w:r>
     <w:r>
       <w:rPr>
@@ -3820,7 +4224,7 @@
         <w:sz w:val="16"/>
         <w:szCs w:val="16"/>
       </w:rPr>
-      <w:fldChar w:fldCharType="begin"/>
+      <w:instrText xml:space="preserve"> FILENAME   \* MERGEFORMAT </w:instrText>
     </w:r>
     <w:r>
       <w:rPr>
@@ -3828,7 +4232,7 @@
         <w:sz w:val="16"/>
         <w:szCs w:val="16"/>
       </w:rPr>
-      <w:instrText xml:space="preserve"> FILENAME   \* MERGEFORMAT </w:instrText>
+      <w:fldChar w:fldCharType="separate"/>
     </w:r>
     <w:r>
       <w:rPr>
@@ -3836,25 +4240,7 @@
         <w:sz w:val="16"/>
         <w:szCs w:val="16"/>
       </w:rPr>
-      <w:fldChar w:fldCharType="separate"/>
-    </w:r>
-    <w:proofErr w:type="spellStart"/>
-    <w:r>
-      <w:rPr>
-        <w:color w:val="82838A"/>
-        <w:sz w:val="16"/>
-        <w:szCs w:val="16"/>
-      </w:rPr>
-      <w:t>Projectplan</w:t>
-    </w:r>
-    <w:proofErr w:type="spellEnd"/>
-    <w:r>
-      <w:rPr>
-        <w:color w:val="82838A"/>
-        <w:sz w:val="16"/>
-        <w:szCs w:val="16"/>
-      </w:rPr>
-      <w:t xml:space="preserve"> Template - English v3.docx</w:t>
+      <w:t>Projectplan Template - English v3.docx</w:t>
     </w:r>
     <w:r>
       <w:rPr>
@@ -4096,6 +4482,92 @@
     </w:lvl>
   </w:abstractNum>
   <w:abstractNum w:abstractNumId="1" w15:restartNumberingAfterBreak="0">
+    <w:nsid w:val="0C984A67"/>
+    <w:multiLevelType w:val="multilevel"/>
+    <w:tmpl w:val="0409001F"/>
+    <w:lvl w:ilvl="0">
+      <w:start w:val="1"/>
+      <w:numFmt w:val="decimal"/>
+      <w:lvlText w:val="%1."/>
+      <w:lvlJc w:val="left"/>
+      <w:pPr>
+        <w:ind w:left="360" w:hanging="360"/>
+      </w:pPr>
+    </w:lvl>
+    <w:lvl w:ilvl="1">
+      <w:start w:val="1"/>
+      <w:numFmt w:val="decimal"/>
+      <w:lvlText w:val="%1.%2."/>
+      <w:lvlJc w:val="left"/>
+      <w:pPr>
+        <w:ind w:left="792" w:hanging="432"/>
+      </w:pPr>
+    </w:lvl>
+    <w:lvl w:ilvl="2">
+      <w:start w:val="1"/>
+      <w:numFmt w:val="decimal"/>
+      <w:lvlText w:val="%1.%2.%3."/>
+      <w:lvlJc w:val="left"/>
+      <w:pPr>
+        <w:ind w:left="1224" w:hanging="504"/>
+      </w:pPr>
+    </w:lvl>
+    <w:lvl w:ilvl="3">
+      <w:start w:val="1"/>
+      <w:numFmt w:val="decimal"/>
+      <w:lvlText w:val="%1.%2.%3.%4."/>
+      <w:lvlJc w:val="left"/>
+      <w:pPr>
+        <w:ind w:left="1728" w:hanging="648"/>
+      </w:pPr>
+    </w:lvl>
+    <w:lvl w:ilvl="4">
+      <w:start w:val="1"/>
+      <w:numFmt w:val="decimal"/>
+      <w:lvlText w:val="%1.%2.%3.%4.%5."/>
+      <w:lvlJc w:val="left"/>
+      <w:pPr>
+        <w:ind w:left="2232" w:hanging="792"/>
+      </w:pPr>
+    </w:lvl>
+    <w:lvl w:ilvl="5">
+      <w:start w:val="1"/>
+      <w:numFmt w:val="decimal"/>
+      <w:lvlText w:val="%1.%2.%3.%4.%5.%6."/>
+      <w:lvlJc w:val="left"/>
+      <w:pPr>
+        <w:ind w:left="2736" w:hanging="936"/>
+      </w:pPr>
+    </w:lvl>
+    <w:lvl w:ilvl="6">
+      <w:start w:val="1"/>
+      <w:numFmt w:val="decimal"/>
+      <w:lvlText w:val="%1.%2.%3.%4.%5.%6.%7."/>
+      <w:lvlJc w:val="left"/>
+      <w:pPr>
+        <w:ind w:left="3240" w:hanging="1080"/>
+      </w:pPr>
+    </w:lvl>
+    <w:lvl w:ilvl="7">
+      <w:start w:val="1"/>
+      <w:numFmt w:val="decimal"/>
+      <w:lvlText w:val="%1.%2.%3.%4.%5.%6.%7.%8."/>
+      <w:lvlJc w:val="left"/>
+      <w:pPr>
+        <w:ind w:left="3744" w:hanging="1224"/>
+      </w:pPr>
+    </w:lvl>
+    <w:lvl w:ilvl="8">
+      <w:start w:val="1"/>
+      <w:numFmt w:val="decimal"/>
+      <w:lvlText w:val="%1.%2.%3.%4.%5.%6.%7.%8.%9."/>
+      <w:lvlJc w:val="left"/>
+      <w:pPr>
+        <w:ind w:left="4320" w:hanging="1440"/>
+      </w:pPr>
+    </w:lvl>
+  </w:abstractNum>
+  <w:abstractNum w:abstractNumId="2" w15:restartNumberingAfterBreak="0">
     <w:nsid w:val="0D5233CB"/>
     <w:multiLevelType w:val="hybridMultilevel"/>
     <w:tmpl w:val="7A3600D0"/>
@@ -4210,7 +4682,120 @@
       </w:rPr>
     </w:lvl>
   </w:abstractNum>
-  <w:abstractNum w:abstractNumId="2" w15:restartNumberingAfterBreak="0">
+  <w:abstractNum w:abstractNumId="3" w15:restartNumberingAfterBreak="0">
+    <w:nsid w:val="11C85019"/>
+    <w:multiLevelType w:val="hybridMultilevel"/>
+    <w:tmpl w:val="0CF80272"/>
+    <w:lvl w:ilvl="0" w:tplc="04090001">
+      <w:start w:val="1"/>
+      <w:numFmt w:val="bullet"/>
+      <w:lvlText w:val=""/>
+      <w:lvlJc w:val="left"/>
+      <w:pPr>
+        <w:ind w:left="720" w:hanging="360"/>
+      </w:pPr>
+      <w:rPr>
+        <w:rFonts w:ascii="Symbol" w:hAnsi="Symbol" w:hint="default"/>
+      </w:rPr>
+    </w:lvl>
+    <w:lvl w:ilvl="1" w:tplc="04090003" w:tentative="1">
+      <w:start w:val="1"/>
+      <w:numFmt w:val="bullet"/>
+      <w:lvlText w:val="o"/>
+      <w:lvlJc w:val="left"/>
+      <w:pPr>
+        <w:ind w:left="1440" w:hanging="360"/>
+      </w:pPr>
+      <w:rPr>
+        <w:rFonts w:ascii="Courier New" w:hAnsi="Courier New" w:cs="Courier New" w:hint="default"/>
+      </w:rPr>
+    </w:lvl>
+    <w:lvl w:ilvl="2" w:tplc="04090005" w:tentative="1">
+      <w:start w:val="1"/>
+      <w:numFmt w:val="bullet"/>
+      <w:lvlText w:val=""/>
+      <w:lvlJc w:val="left"/>
+      <w:pPr>
+        <w:ind w:left="2160" w:hanging="360"/>
+      </w:pPr>
+      <w:rPr>
+        <w:rFonts w:ascii="Wingdings" w:hAnsi="Wingdings" w:hint="default"/>
+      </w:rPr>
+    </w:lvl>
+    <w:lvl w:ilvl="3" w:tplc="04090001" w:tentative="1">
+      <w:start w:val="1"/>
+      <w:numFmt w:val="bullet"/>
+      <w:lvlText w:val=""/>
+      <w:lvlJc w:val="left"/>
+      <w:pPr>
+        <w:ind w:left="2880" w:hanging="360"/>
+      </w:pPr>
+      <w:rPr>
+        <w:rFonts w:ascii="Symbol" w:hAnsi="Symbol" w:hint="default"/>
+      </w:rPr>
+    </w:lvl>
+    <w:lvl w:ilvl="4" w:tplc="04090003" w:tentative="1">
+      <w:start w:val="1"/>
+      <w:numFmt w:val="bullet"/>
+      <w:lvlText w:val="o"/>
+      <w:lvlJc w:val="left"/>
+      <w:pPr>
+        <w:ind w:left="3600" w:hanging="360"/>
+      </w:pPr>
+      <w:rPr>
+        <w:rFonts w:ascii="Courier New" w:hAnsi="Courier New" w:cs="Courier New" w:hint="default"/>
+      </w:rPr>
+    </w:lvl>
+    <w:lvl w:ilvl="5" w:tplc="04090005" w:tentative="1">
+      <w:start w:val="1"/>
+      <w:numFmt w:val="bullet"/>
+      <w:lvlText w:val=""/>
+      <w:lvlJc w:val="left"/>
+      <w:pPr>
+        <w:ind w:left="4320" w:hanging="360"/>
+      </w:pPr>
+      <w:rPr>
+        <w:rFonts w:ascii="Wingdings" w:hAnsi="Wingdings" w:hint="default"/>
+      </w:rPr>
+    </w:lvl>
+    <w:lvl w:ilvl="6" w:tplc="04090001" w:tentative="1">
+      <w:start w:val="1"/>
+      <w:numFmt w:val="bullet"/>
+      <w:lvlText w:val=""/>
+      <w:lvlJc w:val="left"/>
+      <w:pPr>
+        <w:ind w:left="5040" w:hanging="360"/>
+      </w:pPr>
+      <w:rPr>
+        <w:rFonts w:ascii="Symbol" w:hAnsi="Symbol" w:hint="default"/>
+      </w:rPr>
+    </w:lvl>
+    <w:lvl w:ilvl="7" w:tplc="04090003" w:tentative="1">
+      <w:start w:val="1"/>
+      <w:numFmt w:val="bullet"/>
+      <w:lvlText w:val="o"/>
+      <w:lvlJc w:val="left"/>
+      <w:pPr>
+        <w:ind w:left="5760" w:hanging="360"/>
+      </w:pPr>
+      <w:rPr>
+        <w:rFonts w:ascii="Courier New" w:hAnsi="Courier New" w:cs="Courier New" w:hint="default"/>
+      </w:rPr>
+    </w:lvl>
+    <w:lvl w:ilvl="8" w:tplc="04090005" w:tentative="1">
+      <w:start w:val="1"/>
+      <w:numFmt w:val="bullet"/>
+      <w:lvlText w:val=""/>
+      <w:lvlJc w:val="left"/>
+      <w:pPr>
+        <w:ind w:left="6480" w:hanging="360"/>
+      </w:pPr>
+      <w:rPr>
+        <w:rFonts w:ascii="Wingdings" w:hAnsi="Wingdings" w:hint="default"/>
+      </w:rPr>
+    </w:lvl>
+  </w:abstractNum>
+  <w:abstractNum w:abstractNumId="4" w15:restartNumberingAfterBreak="0">
     <w:nsid w:val="186B060F"/>
     <w:multiLevelType w:val="hybridMultilevel"/>
     <w:tmpl w:val="007034DC"/>
@@ -4325,7 +4910,7 @@
       </w:pPr>
     </w:lvl>
   </w:abstractNum>
-  <w:abstractNum w:abstractNumId="3" w15:restartNumberingAfterBreak="0">
+  <w:abstractNum w:abstractNumId="5" w15:restartNumberingAfterBreak="0">
     <w:nsid w:val="1D4F0EEB"/>
     <w:multiLevelType w:val="hybridMultilevel"/>
     <w:tmpl w:val="FA2E42AA"/>
@@ -4438,7 +5023,7 @@
       </w:rPr>
     </w:lvl>
   </w:abstractNum>
-  <w:abstractNum w:abstractNumId="4" w15:restartNumberingAfterBreak="0">
+  <w:abstractNum w:abstractNumId="6" w15:restartNumberingAfterBreak="0">
     <w:nsid w:val="24394F5A"/>
     <w:multiLevelType w:val="hybridMultilevel"/>
     <w:tmpl w:val="A0964BA4"/>
@@ -4554,7 +5139,122 @@
       </w:rPr>
     </w:lvl>
   </w:abstractNum>
-  <w:abstractNum w:abstractNumId="5" w15:restartNumberingAfterBreak="0">
+  <w:abstractNum w:abstractNumId="7" w15:restartNumberingAfterBreak="0">
+    <w:nsid w:val="249E080C"/>
+    <w:multiLevelType w:val="multilevel"/>
+    <w:tmpl w:val="1A54817A"/>
+    <w:lvl w:ilvl="0">
+      <w:start w:val="1"/>
+      <w:numFmt w:val="decimal"/>
+      <w:lvlText w:val="%1."/>
+      <w:lvlJc w:val="left"/>
+      <w:pPr>
+        <w:ind w:left="360" w:hanging="360"/>
+      </w:pPr>
+      <w:rPr>
+        <w:rFonts w:hint="default"/>
+      </w:rPr>
+    </w:lvl>
+    <w:lvl w:ilvl="1">
+      <w:start w:val="6"/>
+      <w:numFmt w:val="decimal"/>
+      <w:lvlText w:val="%1.%2."/>
+      <w:lvlJc w:val="left"/>
+      <w:pPr>
+        <w:ind w:left="432" w:hanging="432"/>
+      </w:pPr>
+      <w:rPr>
+        <w:rFonts w:hint="default"/>
+        <w:b w:val="0"/>
+        <w:bCs w:val="0"/>
+      </w:rPr>
+    </w:lvl>
+    <w:lvl w:ilvl="2">
+      <w:start w:val="1"/>
+      <w:numFmt w:val="decimal"/>
+      <w:lvlText w:val="%1.%2.%3."/>
+      <w:lvlJc w:val="left"/>
+      <w:pPr>
+        <w:ind w:left="1224" w:hanging="504"/>
+      </w:pPr>
+      <w:rPr>
+        <w:rFonts w:hint="default"/>
+      </w:rPr>
+    </w:lvl>
+    <w:lvl w:ilvl="3">
+      <w:start w:val="1"/>
+      <w:numFmt w:val="decimal"/>
+      <w:lvlText w:val="%1.%2.%3.%4."/>
+      <w:lvlJc w:val="left"/>
+      <w:pPr>
+        <w:ind w:left="1728" w:hanging="648"/>
+      </w:pPr>
+      <w:rPr>
+        <w:rFonts w:hint="default"/>
+      </w:rPr>
+    </w:lvl>
+    <w:lvl w:ilvl="4">
+      <w:start w:val="1"/>
+      <w:numFmt w:val="decimal"/>
+      <w:lvlText w:val="%1.%2.%3.%4.%5."/>
+      <w:lvlJc w:val="left"/>
+      <w:pPr>
+        <w:ind w:left="2232" w:hanging="792"/>
+      </w:pPr>
+      <w:rPr>
+        <w:rFonts w:hint="default"/>
+      </w:rPr>
+    </w:lvl>
+    <w:lvl w:ilvl="5">
+      <w:start w:val="1"/>
+      <w:numFmt w:val="decimal"/>
+      <w:lvlText w:val="%1.%2.%3.%4.%5.%6."/>
+      <w:lvlJc w:val="left"/>
+      <w:pPr>
+        <w:ind w:left="2736" w:hanging="936"/>
+      </w:pPr>
+      <w:rPr>
+        <w:rFonts w:hint="default"/>
+      </w:rPr>
+    </w:lvl>
+    <w:lvl w:ilvl="6">
+      <w:start w:val="1"/>
+      <w:numFmt w:val="decimal"/>
+      <w:lvlText w:val="%1.%2.%3.%4.%5.%6.%7."/>
+      <w:lvlJc w:val="left"/>
+      <w:pPr>
+        <w:ind w:left="3240" w:hanging="1080"/>
+      </w:pPr>
+      <w:rPr>
+        <w:rFonts w:hint="default"/>
+      </w:rPr>
+    </w:lvl>
+    <w:lvl w:ilvl="7">
+      <w:start w:val="1"/>
+      <w:numFmt w:val="decimal"/>
+      <w:lvlText w:val="%1.%2.%3.%4.%5.%6.%7.%8."/>
+      <w:lvlJc w:val="left"/>
+      <w:pPr>
+        <w:ind w:left="3744" w:hanging="1224"/>
+      </w:pPr>
+      <w:rPr>
+        <w:rFonts w:hint="default"/>
+      </w:rPr>
+    </w:lvl>
+    <w:lvl w:ilvl="8">
+      <w:start w:val="1"/>
+      <w:numFmt w:val="decimal"/>
+      <w:lvlText w:val="%1.%2.%3.%4.%5.%6.%7.%8.%9."/>
+      <w:lvlJc w:val="left"/>
+      <w:pPr>
+        <w:ind w:left="4320" w:hanging="1440"/>
+      </w:pPr>
+      <w:rPr>
+        <w:rFonts w:hint="default"/>
+      </w:rPr>
+    </w:lvl>
+  </w:abstractNum>
+  <w:abstractNum w:abstractNumId="8" w15:restartNumberingAfterBreak="0">
     <w:nsid w:val="31960095"/>
     <w:multiLevelType w:val="hybridMultilevel"/>
     <w:tmpl w:val="4DD6685C"/>
@@ -4667,7 +5367,7 @@
       </w:pPr>
     </w:lvl>
   </w:abstractNum>
-  <w:abstractNum w:abstractNumId="6" w15:restartNumberingAfterBreak="0">
+  <w:abstractNum w:abstractNumId="9" w15:restartNumberingAfterBreak="0">
     <w:nsid w:val="34892AF0"/>
     <w:multiLevelType w:val="hybridMultilevel"/>
     <w:tmpl w:val="01CC5B10"/>
@@ -4780,10 +5480,10 @@
       </w:pPr>
     </w:lvl>
   </w:abstractNum>
-  <w:abstractNum w:abstractNumId="7" w15:restartNumberingAfterBreak="0">
+  <w:abstractNum w:abstractNumId="10" w15:restartNumberingAfterBreak="0">
     <w:nsid w:val="36273606"/>
     <w:multiLevelType w:val="multilevel"/>
-    <w:tmpl w:val="12EE8876"/>
+    <w:tmpl w:val="CACC7644"/>
     <w:lvl w:ilvl="0">
       <w:start w:val="1"/>
       <w:numFmt w:val="decimal"/>
@@ -4876,6 +5576,8 @@
       </w:pPr>
       <w:rPr>
         <w:rFonts w:hint="default"/>
+        <w:b w:val="0"/>
+        <w:bCs/>
       </w:rPr>
     </w:lvl>
     <w:lvl w:ilvl="3">
@@ -4969,7 +5671,208 @@
       </w:rPr>
     </w:lvl>
   </w:abstractNum>
-  <w:abstractNum w:abstractNumId="8" w15:restartNumberingAfterBreak="0">
+  <w:abstractNum w:abstractNumId="11" w15:restartNumberingAfterBreak="0">
+    <w:nsid w:val="36F34DC9"/>
+    <w:multiLevelType w:val="multilevel"/>
+    <w:tmpl w:val="9D98453E"/>
+    <w:lvl w:ilvl="0">
+      <w:start w:val="1"/>
+      <w:numFmt w:val="decimal"/>
+      <w:lvlText w:val="%1."/>
+      <w:lvlJc w:val="left"/>
+      <w:pPr>
+        <w:ind w:left="360" w:hanging="360"/>
+      </w:pPr>
+      <w:rPr>
+        <w:rFonts w:hint="default"/>
+      </w:rPr>
+    </w:lvl>
+    <w:lvl w:ilvl="1">
+      <w:start w:val="1"/>
+      <w:numFmt w:val="decimal"/>
+      <w:lvlText w:val="%1.%2."/>
+      <w:lvlJc w:val="left"/>
+      <w:pPr>
+        <w:ind w:left="792" w:hanging="432"/>
+      </w:pPr>
+      <w:rPr>
+        <w:rFonts w:hint="default"/>
+      </w:rPr>
+    </w:lvl>
+    <w:lvl w:ilvl="2">
+      <w:start w:val="1"/>
+      <w:numFmt w:val="decimal"/>
+      <w:lvlText w:val="%1.6.%3."/>
+      <w:lvlJc w:val="left"/>
+      <w:pPr>
+        <w:ind w:left="1072" w:hanging="504"/>
+      </w:pPr>
+      <w:rPr>
+        <w:rFonts w:hint="default"/>
+        <w:b w:val="0"/>
+        <w:bCs w:val="0"/>
+      </w:rPr>
+    </w:lvl>
+    <w:lvl w:ilvl="3">
+      <w:start w:val="1"/>
+      <w:numFmt w:val="decimal"/>
+      <w:lvlText w:val="%1.6.%3.%4."/>
+      <w:lvlJc w:val="left"/>
+      <w:pPr>
+        <w:ind w:left="1728" w:hanging="648"/>
+      </w:pPr>
+      <w:rPr>
+        <w:rFonts w:hint="default"/>
+      </w:rPr>
+    </w:lvl>
+    <w:lvl w:ilvl="4">
+      <w:start w:val="1"/>
+      <w:numFmt w:val="decimal"/>
+      <w:lvlText w:val="%1.%2.%3.%4.%5."/>
+      <w:lvlJc w:val="left"/>
+      <w:pPr>
+        <w:ind w:left="2232" w:hanging="792"/>
+      </w:pPr>
+      <w:rPr>
+        <w:rFonts w:hint="default"/>
+      </w:rPr>
+    </w:lvl>
+    <w:lvl w:ilvl="5">
+      <w:start w:val="1"/>
+      <w:numFmt w:val="decimal"/>
+      <w:lvlText w:val="%1.%2.%3.%4.%5.%6."/>
+      <w:lvlJc w:val="left"/>
+      <w:pPr>
+        <w:ind w:left="2736" w:hanging="936"/>
+      </w:pPr>
+      <w:rPr>
+        <w:rFonts w:hint="default"/>
+      </w:rPr>
+    </w:lvl>
+    <w:lvl w:ilvl="6">
+      <w:start w:val="1"/>
+      <w:numFmt w:val="decimal"/>
+      <w:lvlText w:val="%1.%2.%3.%4.%5.%6.%7."/>
+      <w:lvlJc w:val="left"/>
+      <w:pPr>
+        <w:ind w:left="3240" w:hanging="1080"/>
+      </w:pPr>
+      <w:rPr>
+        <w:rFonts w:hint="default"/>
+      </w:rPr>
+    </w:lvl>
+    <w:lvl w:ilvl="7">
+      <w:start w:val="1"/>
+      <w:numFmt w:val="decimal"/>
+      <w:lvlText w:val="%1.%2.%3.%4.%5.%6.%7.%8."/>
+      <w:lvlJc w:val="left"/>
+      <w:pPr>
+        <w:ind w:left="3744" w:hanging="1224"/>
+      </w:pPr>
+      <w:rPr>
+        <w:rFonts w:hint="default"/>
+      </w:rPr>
+    </w:lvl>
+    <w:lvl w:ilvl="8">
+      <w:start w:val="1"/>
+      <w:numFmt w:val="decimal"/>
+      <w:lvlText w:val="%1.%2.%3.%4.%5.%6.%7.%8.%9."/>
+      <w:lvlJc w:val="left"/>
+      <w:pPr>
+        <w:ind w:left="4320" w:hanging="1440"/>
+      </w:pPr>
+      <w:rPr>
+        <w:rFonts w:hint="default"/>
+      </w:rPr>
+    </w:lvl>
+  </w:abstractNum>
+  <w:abstractNum w:abstractNumId="12" w15:restartNumberingAfterBreak="0">
+    <w:nsid w:val="3A297E91"/>
+    <w:multiLevelType w:val="multilevel"/>
+    <w:tmpl w:val="0409001F"/>
+    <w:lvl w:ilvl="0">
+      <w:start w:val="1"/>
+      <w:numFmt w:val="decimal"/>
+      <w:lvlText w:val="%1."/>
+      <w:lvlJc w:val="left"/>
+      <w:pPr>
+        <w:ind w:left="360" w:hanging="360"/>
+      </w:pPr>
+    </w:lvl>
+    <w:lvl w:ilvl="1">
+      <w:start w:val="1"/>
+      <w:numFmt w:val="decimal"/>
+      <w:lvlText w:val="%1.%2."/>
+      <w:lvlJc w:val="left"/>
+      <w:pPr>
+        <w:ind w:left="792" w:hanging="432"/>
+      </w:pPr>
+    </w:lvl>
+    <w:lvl w:ilvl="2">
+      <w:start w:val="1"/>
+      <w:numFmt w:val="decimal"/>
+      <w:lvlText w:val="%1.%2.%3."/>
+      <w:lvlJc w:val="left"/>
+      <w:pPr>
+        <w:ind w:left="1224" w:hanging="504"/>
+      </w:pPr>
+    </w:lvl>
+    <w:lvl w:ilvl="3">
+      <w:start w:val="1"/>
+      <w:numFmt w:val="decimal"/>
+      <w:lvlText w:val="%1.%2.%3.%4."/>
+      <w:lvlJc w:val="left"/>
+      <w:pPr>
+        <w:ind w:left="1728" w:hanging="648"/>
+      </w:pPr>
+    </w:lvl>
+    <w:lvl w:ilvl="4">
+      <w:start w:val="1"/>
+      <w:numFmt w:val="decimal"/>
+      <w:lvlText w:val="%1.%2.%3.%4.%5."/>
+      <w:lvlJc w:val="left"/>
+      <w:pPr>
+        <w:ind w:left="2232" w:hanging="792"/>
+      </w:pPr>
+    </w:lvl>
+    <w:lvl w:ilvl="5">
+      <w:start w:val="1"/>
+      <w:numFmt w:val="decimal"/>
+      <w:lvlText w:val="%1.%2.%3.%4.%5.%6."/>
+      <w:lvlJc w:val="left"/>
+      <w:pPr>
+        <w:ind w:left="2736" w:hanging="936"/>
+      </w:pPr>
+    </w:lvl>
+    <w:lvl w:ilvl="6">
+      <w:start w:val="1"/>
+      <w:numFmt w:val="decimal"/>
+      <w:lvlText w:val="%1.%2.%3.%4.%5.%6.%7."/>
+      <w:lvlJc w:val="left"/>
+      <w:pPr>
+        <w:ind w:left="3240" w:hanging="1080"/>
+      </w:pPr>
+    </w:lvl>
+    <w:lvl w:ilvl="7">
+      <w:start w:val="1"/>
+      <w:numFmt w:val="decimal"/>
+      <w:lvlText w:val="%1.%2.%3.%4.%5.%6.%7.%8."/>
+      <w:lvlJc w:val="left"/>
+      <w:pPr>
+        <w:ind w:left="3744" w:hanging="1224"/>
+      </w:pPr>
+    </w:lvl>
+    <w:lvl w:ilvl="8">
+      <w:start w:val="1"/>
+      <w:numFmt w:val="decimal"/>
+      <w:lvlText w:val="%1.%2.%3.%4.%5.%6.%7.%8.%9."/>
+      <w:lvlJc w:val="left"/>
+      <w:pPr>
+        <w:ind w:left="4320" w:hanging="1440"/>
+      </w:pPr>
+    </w:lvl>
+  </w:abstractNum>
+  <w:abstractNum w:abstractNumId="13" w15:restartNumberingAfterBreak="0">
     <w:nsid w:val="44C50263"/>
     <w:multiLevelType w:val="hybridMultilevel"/>
     <w:tmpl w:val="6F00E5C6"/>
@@ -5082,7 +5985,93 @@
       </w:pPr>
     </w:lvl>
   </w:abstractNum>
-  <w:abstractNum w:abstractNumId="9" w15:restartNumberingAfterBreak="0">
+  <w:abstractNum w:abstractNumId="14" w15:restartNumberingAfterBreak="0">
+    <w:nsid w:val="47472A21"/>
+    <w:multiLevelType w:val="multilevel"/>
+    <w:tmpl w:val="0409001F"/>
+    <w:lvl w:ilvl="0">
+      <w:start w:val="1"/>
+      <w:numFmt w:val="decimal"/>
+      <w:lvlText w:val="%1."/>
+      <w:lvlJc w:val="left"/>
+      <w:pPr>
+        <w:ind w:left="360" w:hanging="360"/>
+      </w:pPr>
+    </w:lvl>
+    <w:lvl w:ilvl="1">
+      <w:start w:val="1"/>
+      <w:numFmt w:val="decimal"/>
+      <w:lvlText w:val="%1.%2."/>
+      <w:lvlJc w:val="left"/>
+      <w:pPr>
+        <w:ind w:left="792" w:hanging="432"/>
+      </w:pPr>
+    </w:lvl>
+    <w:lvl w:ilvl="2">
+      <w:start w:val="1"/>
+      <w:numFmt w:val="decimal"/>
+      <w:lvlText w:val="%1.%2.%3."/>
+      <w:lvlJc w:val="left"/>
+      <w:pPr>
+        <w:ind w:left="1224" w:hanging="504"/>
+      </w:pPr>
+    </w:lvl>
+    <w:lvl w:ilvl="3">
+      <w:start w:val="1"/>
+      <w:numFmt w:val="decimal"/>
+      <w:lvlText w:val="%1.%2.%3.%4."/>
+      <w:lvlJc w:val="left"/>
+      <w:pPr>
+        <w:ind w:left="1728" w:hanging="648"/>
+      </w:pPr>
+    </w:lvl>
+    <w:lvl w:ilvl="4">
+      <w:start w:val="1"/>
+      <w:numFmt w:val="decimal"/>
+      <w:lvlText w:val="%1.%2.%3.%4.%5."/>
+      <w:lvlJc w:val="left"/>
+      <w:pPr>
+        <w:ind w:left="2232" w:hanging="792"/>
+      </w:pPr>
+    </w:lvl>
+    <w:lvl w:ilvl="5">
+      <w:start w:val="1"/>
+      <w:numFmt w:val="decimal"/>
+      <w:lvlText w:val="%1.%2.%3.%4.%5.%6."/>
+      <w:lvlJc w:val="left"/>
+      <w:pPr>
+        <w:ind w:left="2736" w:hanging="936"/>
+      </w:pPr>
+    </w:lvl>
+    <w:lvl w:ilvl="6">
+      <w:start w:val="1"/>
+      <w:numFmt w:val="decimal"/>
+      <w:lvlText w:val="%1.%2.%3.%4.%5.%6.%7."/>
+      <w:lvlJc w:val="left"/>
+      <w:pPr>
+        <w:ind w:left="3240" w:hanging="1080"/>
+      </w:pPr>
+    </w:lvl>
+    <w:lvl w:ilvl="7">
+      <w:start w:val="1"/>
+      <w:numFmt w:val="decimal"/>
+      <w:lvlText w:val="%1.%2.%3.%4.%5.%6.%7.%8."/>
+      <w:lvlJc w:val="left"/>
+      <w:pPr>
+        <w:ind w:left="3744" w:hanging="1224"/>
+      </w:pPr>
+    </w:lvl>
+    <w:lvl w:ilvl="8">
+      <w:start w:val="1"/>
+      <w:numFmt w:val="decimal"/>
+      <w:lvlText w:val="%1.%2.%3.%4.%5.%6.%7.%8.%9."/>
+      <w:lvlJc w:val="left"/>
+      <w:pPr>
+        <w:ind w:left="4320" w:hanging="1440"/>
+      </w:pPr>
+    </w:lvl>
+  </w:abstractNum>
+  <w:abstractNum w:abstractNumId="15" w15:restartNumberingAfterBreak="0">
     <w:nsid w:val="4C703A0F"/>
     <w:multiLevelType w:val="hybridMultilevel"/>
     <w:tmpl w:val="7A800098"/>
@@ -5195,7 +6184,7 @@
       </w:pPr>
     </w:lvl>
   </w:abstractNum>
-  <w:abstractNum w:abstractNumId="10" w15:restartNumberingAfterBreak="0">
+  <w:abstractNum w:abstractNumId="16" w15:restartNumberingAfterBreak="0">
     <w:nsid w:val="4EE568CE"/>
     <w:multiLevelType w:val="hybridMultilevel"/>
     <w:tmpl w:val="C22E04DA"/>
@@ -5310,7 +6299,7 @@
       </w:pPr>
     </w:lvl>
   </w:abstractNum>
-  <w:abstractNum w:abstractNumId="11" w15:restartNumberingAfterBreak="0">
+  <w:abstractNum w:abstractNumId="17" w15:restartNumberingAfterBreak="0">
     <w:nsid w:val="788975F3"/>
     <w:multiLevelType w:val="hybridMultilevel"/>
     <w:tmpl w:val="033676A2"/>
@@ -5423,7 +6412,7 @@
       </w:pPr>
     </w:lvl>
   </w:abstractNum>
-  <w:abstractNum w:abstractNumId="12" w15:restartNumberingAfterBreak="0">
+  <w:abstractNum w:abstractNumId="18" w15:restartNumberingAfterBreak="0">
     <w:nsid w:val="7F8A3529"/>
     <w:multiLevelType w:val="hybridMultilevel"/>
     <w:tmpl w:val="3B325574"/>
@@ -5513,46 +6502,46 @@
     </w:lvl>
   </w:abstractNum>
   <w:num w:numId="1" w16cid:durableId="610629446">
-    <w:abstractNumId w:val="3"/>
+    <w:abstractNumId w:val="5"/>
   </w:num>
   <w:num w:numId="2" w16cid:durableId="1167135093">
-    <w:abstractNumId w:val="1"/>
+    <w:abstractNumId w:val="2"/>
   </w:num>
   <w:num w:numId="3" w16cid:durableId="519667519">
-    <w:abstractNumId w:val="4"/>
+    <w:abstractNumId w:val="6"/>
   </w:num>
   <w:num w:numId="4" w16cid:durableId="271285324">
-    <w:abstractNumId w:val="7"/>
+    <w:abstractNumId w:val="10"/>
   </w:num>
   <w:num w:numId="5" w16cid:durableId="652102938">
-    <w:abstractNumId w:val="6"/>
+    <w:abstractNumId w:val="9"/>
   </w:num>
   <w:num w:numId="6" w16cid:durableId="840320103">
-    <w:abstractNumId w:val="11"/>
+    <w:abstractNumId w:val="17"/>
   </w:num>
   <w:num w:numId="7" w16cid:durableId="1793019379">
-    <w:abstractNumId w:val="9"/>
+    <w:abstractNumId w:val="15"/>
   </w:num>
   <w:num w:numId="8" w16cid:durableId="976378906">
-    <w:abstractNumId w:val="2"/>
+    <w:abstractNumId w:val="4"/>
   </w:num>
   <w:num w:numId="9" w16cid:durableId="876426638">
     <w:abstractNumId w:val="0"/>
   </w:num>
   <w:num w:numId="10" w16cid:durableId="786657992">
-    <w:abstractNumId w:val="5"/>
+    <w:abstractNumId w:val="8"/>
   </w:num>
   <w:num w:numId="11" w16cid:durableId="1202746839">
-    <w:abstractNumId w:val="8"/>
+    <w:abstractNumId w:val="13"/>
   </w:num>
   <w:num w:numId="12" w16cid:durableId="1135758195">
-    <w:abstractNumId w:val="10"/>
+    <w:abstractNumId w:val="16"/>
   </w:num>
   <w:num w:numId="13" w16cid:durableId="285815625">
-    <w:abstractNumId w:val="12"/>
+    <w:abstractNumId w:val="18"/>
   </w:num>
   <w:num w:numId="14" w16cid:durableId="671029042">
-    <w:abstractNumId w:val="7"/>
+    <w:abstractNumId w:val="10"/>
     <w:lvlOverride w:ilvl="0">
       <w:startOverride w:val="1"/>
     </w:lvlOverride>
@@ -5582,67 +6571,85 @@
     </w:lvlOverride>
   </w:num>
   <w:num w:numId="15" w16cid:durableId="1108963525">
+    <w:abstractNumId w:val="10"/>
+  </w:num>
+  <w:num w:numId="16" w16cid:durableId="306712181">
+    <w:abstractNumId w:val="10"/>
+  </w:num>
+  <w:num w:numId="17" w16cid:durableId="68383133">
+    <w:abstractNumId w:val="10"/>
+  </w:num>
+  <w:num w:numId="18" w16cid:durableId="893928926">
+    <w:abstractNumId w:val="10"/>
+  </w:num>
+  <w:num w:numId="19" w16cid:durableId="692221025">
+    <w:abstractNumId w:val="10"/>
+  </w:num>
+  <w:num w:numId="20" w16cid:durableId="1558082544">
+    <w:abstractNumId w:val="10"/>
+  </w:num>
+  <w:num w:numId="21" w16cid:durableId="503011441">
+    <w:abstractNumId w:val="10"/>
+  </w:num>
+  <w:num w:numId="22" w16cid:durableId="1714580454">
+    <w:abstractNumId w:val="10"/>
+  </w:num>
+  <w:num w:numId="23" w16cid:durableId="1831947024">
+    <w:abstractNumId w:val="10"/>
+  </w:num>
+  <w:num w:numId="24" w16cid:durableId="1652713006">
+    <w:abstractNumId w:val="10"/>
+  </w:num>
+  <w:num w:numId="25" w16cid:durableId="1891184283">
+    <w:abstractNumId w:val="10"/>
+  </w:num>
+  <w:num w:numId="26" w16cid:durableId="1284649985">
+    <w:abstractNumId w:val="10"/>
+  </w:num>
+  <w:num w:numId="27" w16cid:durableId="255284673">
+    <w:abstractNumId w:val="10"/>
+  </w:num>
+  <w:num w:numId="28" w16cid:durableId="1421213898">
+    <w:abstractNumId w:val="10"/>
+  </w:num>
+  <w:num w:numId="29" w16cid:durableId="466748059">
+    <w:abstractNumId w:val="10"/>
+  </w:num>
+  <w:num w:numId="30" w16cid:durableId="786386337">
+    <w:abstractNumId w:val="10"/>
+  </w:num>
+  <w:num w:numId="31" w16cid:durableId="995065424">
+    <w:abstractNumId w:val="10"/>
+  </w:num>
+  <w:num w:numId="32" w16cid:durableId="745343668">
+    <w:abstractNumId w:val="10"/>
+  </w:num>
+  <w:num w:numId="33" w16cid:durableId="566887265">
+    <w:abstractNumId w:val="10"/>
+  </w:num>
+  <w:num w:numId="34" w16cid:durableId="1327903860">
+    <w:abstractNumId w:val="10"/>
+  </w:num>
+  <w:num w:numId="35" w16cid:durableId="1945646722">
+    <w:abstractNumId w:val="10"/>
+  </w:num>
+  <w:num w:numId="36" w16cid:durableId="1473673951">
+    <w:abstractNumId w:val="3"/>
+  </w:num>
+  <w:num w:numId="37" w16cid:durableId="776943557">
+    <w:abstractNumId w:val="14"/>
+  </w:num>
+  <w:num w:numId="38" w16cid:durableId="2059552238">
+    <w:abstractNumId w:val="1"/>
+  </w:num>
+  <w:num w:numId="39" w16cid:durableId="1850633778">
+    <w:abstractNumId w:val="12"/>
+  </w:num>
+  <w:num w:numId="40" w16cid:durableId="1136604417">
     <w:abstractNumId w:val="7"/>
   </w:num>
-  <w:num w:numId="16" w16cid:durableId="306712181">
-    <w:abstractNumId w:val="7"/>
-  </w:num>
-  <w:num w:numId="17" w16cid:durableId="68383133">
-    <w:abstractNumId w:val="7"/>
-  </w:num>
-  <w:num w:numId="18" w16cid:durableId="893928926">
-    <w:abstractNumId w:val="7"/>
-  </w:num>
-  <w:num w:numId="19" w16cid:durableId="692221025">
-    <w:abstractNumId w:val="7"/>
-  </w:num>
-  <w:num w:numId="20" w16cid:durableId="1558082544">
-    <w:abstractNumId w:val="7"/>
-  </w:num>
-  <w:num w:numId="21" w16cid:durableId="503011441">
-    <w:abstractNumId w:val="7"/>
-  </w:num>
-  <w:num w:numId="22" w16cid:durableId="1714580454">
-    <w:abstractNumId w:val="7"/>
-  </w:num>
-  <w:num w:numId="23" w16cid:durableId="1831947024">
-    <w:abstractNumId w:val="7"/>
-  </w:num>
-  <w:num w:numId="24" w16cid:durableId="1652713006">
-    <w:abstractNumId w:val="7"/>
-  </w:num>
-  <w:num w:numId="25" w16cid:durableId="1891184283">
-    <w:abstractNumId w:val="7"/>
-  </w:num>
-  <w:num w:numId="26" w16cid:durableId="1284649985">
-    <w:abstractNumId w:val="7"/>
-  </w:num>
-  <w:num w:numId="27" w16cid:durableId="255284673">
-    <w:abstractNumId w:val="7"/>
-  </w:num>
-  <w:num w:numId="28" w16cid:durableId="1421213898">
-    <w:abstractNumId w:val="7"/>
-  </w:num>
-  <w:num w:numId="29" w16cid:durableId="466748059">
-    <w:abstractNumId w:val="7"/>
-  </w:num>
-  <w:num w:numId="30" w16cid:durableId="786386337">
-    <w:abstractNumId w:val="7"/>
-  </w:num>
-  <w:num w:numId="31" w16cid:durableId="995065424">
-    <w:abstractNumId w:val="7"/>
-  </w:num>
-  <w:num w:numId="32" w16cid:durableId="745343668">
-    <w:abstractNumId w:val="7"/>
-  </w:num>
-  <w:num w:numId="33" w16cid:durableId="566887265">
-    <w:abstractNumId w:val="7"/>
-  </w:num>
-  <w:num w:numId="34" w16cid:durableId="1327903860">
-    <w:abstractNumId w:val="7"/>
-  </w:num>
-  <w:num w:numId="35" w16cid:durableId="1945646722">
-    <w:abstractNumId w:val="7"/>
+  <w:num w:numId="41" w16cid:durableId="159003442">
+    <w:abstractNumId w:val="11"/>
   </w:num>
 </w:numbering>
 </file>
@@ -6155,6 +7162,7 @@
   <w:style w:type="character" w:default="1" w:styleId="DefaultParagraphFont">
     <w:name w:val="Default Paragraph Font"/>
     <w:uiPriority w:val="1"/>
+    <w:semiHidden/>
     <w:unhideWhenUsed/>
   </w:style>
   <w:style w:type="table" w:default="1" w:styleId="TableNormal">
@@ -6560,6 +7568,17 @@
       <w:szCs w:val="20"/>
       <w:lang w:val="en-GB" w:eastAsia="nl-NL"/>
     </w:rPr>
+  </w:style>
+  <w:style w:type="paragraph" w:styleId="ListParagraph">
+    <w:name w:val="List Paragraph"/>
+    <w:basedOn w:val="Normal"/>
+    <w:uiPriority w:val="34"/>
+    <w:qFormat/>
+    <w:rsid w:val="009C0356"/>
+    <w:pPr>
+      <w:ind w:left="720"/>
+      <w:contextualSpacing/>
+    </w:pPr>
   </w:style>
 </w:styles>
 </file>
@@ -6970,6 +7989,10 @@
 </file>
 
 <file path=customXml/item3.xml><?xml version="1.0" encoding="utf-8"?>
+<b:Sources xmlns:b="http://schemas.openxmlformats.org/officeDocument/2006/bibliography" xmlns="http://schemas.openxmlformats.org/officeDocument/2006/bibliography" SelectedStyle="\APASixthEditionOfficeOnline.xsl" StyleName="APA" Version="6"/>
+</file>
+
+<file path=customXml/item4.xml><?xml version="1.0" encoding="utf-8"?>
 <?mso-contentType ?>
 <FormTemplates xmlns="http://schemas.microsoft.com/sharepoint/v3/contenttype/forms">
   <Display>DocumentLibraryForm</Display>
@@ -7004,6 +8027,14 @@
 </file>
 
 <file path=customXml/itemProps3.xml><?xml version="1.0" encoding="utf-8"?>
+<ds:datastoreItem xmlns:ds="http://schemas.openxmlformats.org/officeDocument/2006/customXml" ds:itemID="{EAF58372-FDA1-408D-93B3-2213D978007D}">
+  <ds:schemaRefs>
+    <ds:schemaRef ds:uri="http://schemas.openxmlformats.org/officeDocument/2006/bibliography"/>
+  </ds:schemaRefs>
+</ds:datastoreItem>
+</file>
+
+<file path=customXml/itemProps4.xml><?xml version="1.0" encoding="utf-8"?>
 <ds:datastoreItem xmlns:ds="http://schemas.openxmlformats.org/officeDocument/2006/customXml" ds:itemID="{8D559B33-4825-405B-ACEB-6F229225D325}">
   <ds:schemaRefs>
     <ds:schemaRef ds:uri="http://schemas.microsoft.com/sharepoint/v3/contenttype/forms"/>

</xml_diff>